<commit_message>
fix: added changes to paper
</commit_message>
<xml_diff>
--- a/docs/paper/submission/Hindsight2020_AlgorithmicFinance_IOS_submission.docx
+++ b/docs/paper/submission/Hindsight2020_AlgorithmicFinance_IOS_submission.docx
@@ -12,14 +12,6 @@
     </w:p>
     <w:p>
       <w:pPr>
-        <w:pStyle w:val="Author"/>
-      </w:pPr>
-      <w:r>
-        <w:t xml:space="preserve">[Rohit Edward Martires] (Independent researcher, [Goa, India]). Email: [rohitmartires14@gmail.com].</w:t>
-      </w:r>
-    </w:p>
-    <w:p>
-      <w:pPr>
         <w:pStyle w:val="Date"/>
       </w:pPr>
       <w:r>
@@ -289,7 +281,7 @@
         <w:t xml:space="preserve">more than one issuer</w:t>
       </w:r>
       <w:r>
-        <w:t xml:space="preserve">. We present</w:t>
+        <w:t xml:space="preserve">.</w:t>
       </w:r>
       <w:r>
         <w:t xml:space="preserve"> </w:t>
@@ -302,23 +294,26 @@
         <w:t xml:space="preserve">Hindsight 20/20</w:t>
       </w:r>
       <w:r>
-        <w:t xml:space="preserve">, an open</w:t>
-      </w:r>
-      <w:r>
-        <w:t xml:space="preserve"> </w:t>
-      </w:r>
-      <w:r>
-        <w:rPr>
-          <w:b/>
-          <w:bCs/>
-        </w:rPr>
-        <w:t xml:space="preserve">LangGraph</w:t>
-      </w:r>
-      <w:r>
-        <w:t xml:space="preserve"> </w:t>
-      </w:r>
-      <w:r>
-        <w:t xml:space="preserve">implementation with structured outputs, optional anonymization, a simulation end date, and a paper backtest. We evaluate the</w:t>
+        <w:t xml:space="preserve"> </w:t>
+      </w:r>
+      <w:r>
+        <w:t xml:space="preserve">extends the open-source</w:t>
+      </w:r>
+      <w:r>
+        <w:t xml:space="preserve"> </w:t>
+      </w:r>
+      <w:r>
+        <w:rPr>
+          <w:b/>
+          <w:bCs/>
+        </w:rPr>
+        <w:t xml:space="preserve">TradingAgents</w:t>
+      </w:r>
+      <w:r>
+        <w:t xml:space="preserve"> </w:t>
+      </w:r>
+      <w:r>
+        <w:t xml:space="preserve">multi-agent LangGraph framework (Xiao et al., 2024) with point-in-time data access, optional ticker anonymization, and a reproducible backtest harness; we evaluate this extended stack under exogenous bear and bull windows. We evaluate the</w:t>
       </w:r>
       <w:r>
         <w:t xml:space="preserve"> </w:t>
@@ -474,7 +469,7 @@
       </w:r>
     </w:p>
     <w:bookmarkEnd w:id="10"/>
-    <w:bookmarkStart w:id="11" w:name="method-system"/>
+    <w:bookmarkStart w:id="13" w:name="method-system"/>
     <w:p>
       <w:pPr>
         <w:pStyle w:val="Heading2"/>
@@ -523,7 +518,23 @@
         <w:t xml:space="preserve"> </w:t>
       </w:r>
       <w:r>
-        <w:t xml:space="preserve">(internal agents, distinct from market regimes), trader, and risk. Section 4 uses</w:t>
+        <w:t xml:space="preserve">(internal agents, distinct from market regimes), trader, and risk. Core analyst → debate → trader → risk routing follows</w:t>
+      </w:r>
+      <w:r>
+        <w:t xml:space="preserve"> </w:t>
+      </w:r>
+      <w:r>
+        <w:rPr>
+          <w:b/>
+          <w:bCs/>
+        </w:rPr>
+        <w:t xml:space="preserve">TradingAgents</w:t>
+      </w:r>
+      <w:r>
+        <w:t xml:space="preserve"> </w:t>
+      </w:r>
+      <w:r>
+        <w:t xml:space="preserve">(Xiao et al., 2024); our modifications focus on temporal data policy, schema-constrained outputs, and the backtest/evaluation pipeline described below. Section 4 uses</w:t>
       </w:r>
       <w:r>
         <w:t xml:space="preserve"> </w:t>
@@ -557,8 +568,294 @@
         <w:t xml:space="preserve">produces wide schedule CSVs.</w:t>
       </w:r>
     </w:p>
+    <w:bookmarkStart w:id="11" w:name="ticker-anonymization"/>
+    <w:p>
+      <w:pPr>
+        <w:pStyle w:val="Heading3"/>
+      </w:pPr>
+      <w:r>
+        <w:rPr>
+          <w:rStyle w:val="SectionNumber"/>
+        </w:rPr>
+        <w:t xml:space="preserve">3.1</w:t>
+      </w:r>
+      <w:r>
+        <w:tab/>
+      </w:r>
+      <w:r>
+        <w:t xml:space="preserve">Ticker anonymization</w:t>
+      </w:r>
+    </w:p>
+    <w:p>
+      <w:pPr>
+        <w:pStyle w:val="FirstParagraph"/>
+      </w:pPr>
+      <w:r>
+        <w:t xml:space="preserve">Large language models trained on public text often encode firm-specific narratives—brand reputation, sector themes, and historical events—tied to ticker symbols and company names. In a point-in-time backtest, that</w:t>
+      </w:r>
+      <w:r>
+        <w:t xml:space="preserve"> </w:t>
+      </w:r>
+      <w:r>
+        <w:rPr>
+          <w:b/>
+          <w:bCs/>
+        </w:rPr>
+        <w:t xml:space="preserve">pretraining leakage</w:t>
+      </w:r>
+      <w:r>
+        <w:t xml:space="preserve"> </w:t>
+      </w:r>
+      <w:r>
+        <w:t xml:space="preserve">can bias decisions: the same vendor data may elicit different agent behavior on</w:t>
+      </w:r>
+      <w:r>
+        <w:t xml:space="preserve"> </w:t>
+      </w:r>
+      <w:r>
+        <w:rPr>
+          <w:rStyle w:val="VerbatimChar"/>
+        </w:rPr>
+        <w:t xml:space="preserve">RELIANCE.NS</w:t>
+      </w:r>
+      <w:r>
+        <w:t xml:space="preserve"> </w:t>
+      </w:r>
+      <w:r>
+        <w:t xml:space="preserve">versus an unseen alias. Hindsight 20/20 optionally</w:t>
+      </w:r>
+      <w:r>
+        <w:t xml:space="preserve"> </w:t>
+      </w:r>
+      <w:r>
+        <w:rPr>
+          <w:b/>
+          <w:bCs/>
+        </w:rPr>
+        <w:t xml:space="preserve">anonymizes the issuer</w:t>
+      </w:r>
+      <w:r>
+        <w:t xml:space="preserve"> </w:t>
+      </w:r>
+      <w:r>
+        <w:t xml:space="preserve">for all LLM-facing prompts and tool outputs: each real symbol maps to a deterministic synthetic id (</w:t>
+      </w:r>
+      <w:r>
+        <w:rPr>
+          <w:rStyle w:val="VerbatimChar"/>
+        </w:rPr>
+        <w:t xml:space="preserve">STOCK_####</w:t>
+      </w:r>
+      <w:r>
+        <w:t xml:space="preserve">, hash-derived); tool wrappers</w:t>
+      </w:r>
+      <w:r>
+        <w:t xml:space="preserve"> </w:t>
+      </w:r>
+      <w:r>
+        <w:rPr>
+          <w:b/>
+          <w:bCs/>
+        </w:rPr>
+        <w:t xml:space="preserve">de-anonymize</w:t>
+      </w:r>
+      <w:r>
+        <w:t xml:space="preserve"> </w:t>
+      </w:r>
+      <w:r>
+        <w:t xml:space="preserve">before market-data API calls, then</w:t>
+      </w:r>
+      <w:r>
+        <w:t xml:space="preserve"> </w:t>
+      </w:r>
+      <w:r>
+        <w:rPr>
+          <w:b/>
+          <w:bCs/>
+        </w:rPr>
+        <w:t xml:space="preserve">re-scrub</w:t>
+      </w:r>
+      <w:r>
+        <w:t xml:space="preserve"> </w:t>
+      </w:r>
+      <w:r>
+        <w:t xml:space="preserve">responses; news headlines additionally pass through a lightweight proper-noun scrubber. Frozen E1 runs use</w:t>
+      </w:r>
+      <w:r>
+        <w:t xml:space="preserve"> </w:t>
+      </w:r>
+      <w:r>
+        <w:rPr>
+          <w:rStyle w:val="VerbatimChar"/>
+          <w:b/>
+          <w:bCs/>
+        </w:rPr>
+        <w:t xml:space="preserve">enable_anonymization=True</w:t>
+      </w:r>
+      <w:r>
+        <w:t xml:space="preserve"> </w:t>
+      </w:r>
+      <w:r>
+        <w:t xml:space="preserve">(default in</w:t>
+      </w:r>
+      <w:r>
+        <w:t xml:space="preserve"> </w:t>
+      </w:r>
+      <w:r>
+        <w:rPr>
+          <w:rStyle w:val="VerbatimChar"/>
+        </w:rPr>
+        <w:t xml:space="preserve">backtest_mvp.py</w:t>
+      </w:r>
+      <w:r>
+        <w:t xml:space="preserve">). We do not ablate anonymization in Section 4—reporting with it</w:t>
+      </w:r>
+      <w:r>
+        <w:t xml:space="preserve"> </w:t>
+      </w:r>
+      <w:r>
+        <w:rPr>
+          <w:b/>
+          <w:bCs/>
+        </w:rPr>
+        <w:t xml:space="preserve">on</w:t>
+      </w:r>
+      <w:r>
+        <w:t xml:space="preserve"> </w:t>
+      </w:r>
+      <w:r>
+        <w:t xml:space="preserve">is a conservative choice that reduces name-based bias when comparing regimes and tickers.</w:t>
+      </w:r>
+    </w:p>
     <w:bookmarkEnd w:id="11"/>
-    <w:bookmarkStart w:id="27" w:name="experiments"/>
+    <w:bookmarkStart w:id="12" w:name="backtest-metrics"/>
+    <w:p>
+      <w:pPr>
+        <w:pStyle w:val="Heading3"/>
+      </w:pPr>
+      <w:r>
+        <w:rPr>
+          <w:rStyle w:val="SectionNumber"/>
+        </w:rPr>
+        <w:t xml:space="preserve">3.2</w:t>
+      </w:r>
+      <w:r>
+        <w:tab/>
+      </w:r>
+      <w:r>
+        <w:t xml:space="preserve">Backtest metrics</w:t>
+      </w:r>
+    </w:p>
+    <w:p>
+      <w:pPr>
+        <w:pStyle w:val="FirstParagraph"/>
+      </w:pPr>
+      <w:r>
+        <w:t xml:space="preserve">The paper ledger records daily agent equity after fees. We report</w:t>
+      </w:r>
+      <w:r>
+        <w:t xml:space="preserve"> </w:t>
+      </w:r>
+      <w:r>
+        <w:rPr>
+          <w:b/>
+          <w:bCs/>
+        </w:rPr>
+        <w:t xml:space="preserve">total return</w:t>
+      </w:r>
+      <w:r>
+        <w:t xml:space="preserve"> </w:t>
+      </w:r>
+      <w:r>
+        <w:t xml:space="preserve">on agent equity;</w:t>
+      </w:r>
+      <w:r>
+        <w:t xml:space="preserve"> </w:t>
+      </w:r>
+      <w:r>
+        <w:rPr>
+          <w:b/>
+          <w:bCs/>
+        </w:rPr>
+        <w:t xml:space="preserve">maximum drawdown (MDD)</w:t>
+      </w:r>
+      <w:r>
+        <w:t xml:space="preserve"> </w:t>
+      </w:r>
+      <w:r>
+        <w:t xml:space="preserve">as peak-to-trough decline on the agent equity curve, with</w:t>
+      </w:r>
+      <w:r>
+        <w:t xml:space="preserve"> </w:t>
+      </w:r>
+      <w:r>
+        <w:rPr>
+          <w:b/>
+          <w:bCs/>
+        </w:rPr>
+        <w:t xml:space="preserve">buy-and-hold MDD</w:t>
+      </w:r>
+      <w:r>
+        <w:t xml:space="preserve"> </w:t>
+      </w:r>
+      <w:r>
+        <w:t xml:space="preserve">on the same underlying adjusted closes for comparison; and</w:t>
+      </w:r>
+      <w:r>
+        <w:t xml:space="preserve"> </w:t>
+      </w:r>
+      <w:r>
+        <w:rPr>
+          <w:b/>
+          <w:bCs/>
+        </w:rPr>
+        <w:t xml:space="preserve">Sharpe ratio</w:t>
+      </w:r>
+      <w:r>
+        <w:t xml:space="preserve"> </w:t>
+      </w:r>
+      <w:r>
+        <w:t xml:space="preserve">as mean daily simple return divided by its standard deviation, scaled by</w:t>
+      </w:r>
+      <w:r>
+        <w:t xml:space="preserve"> </w:t>
+      </w:r>
+      <m:oMath>
+        <m:rad>
+          <m:radPr>
+            <m:degHide m:val="on"/>
+          </m:radPr>
+          <m:deg/>
+          <m:e>
+            <m:r>
+              <m:t>252</m:t>
+            </m:r>
+          </m:e>
+        </m:rad>
+      </m:oMath>
+      <w:r>
+        <w:t xml:space="preserve">.</w:t>
+      </w:r>
+      <w:r>
+        <w:t xml:space="preserve"> </w:t>
+      </w:r>
+      <w:r>
+        <w:rPr>
+          <w:b/>
+          <w:bCs/>
+        </w:rPr>
+        <w:t xml:space="preserve">No risk-free rate is subtracted</w:t>
+      </w:r>
+      <w:r>
+        <w:t xml:space="preserve"> </w:t>
+      </w:r>
+      <w:r>
+        <w:t xml:space="preserve">in Frozen E1 (excess Sharpe is future work). Short windows (67–111 trading days) yield noisy Sharpe estimates for discrete-signal agents.</w:t>
+      </w:r>
+    </w:p>
+    <w:bookmarkEnd w:id="12"/>
+    <w:bookmarkEnd w:id="13"/>
+    <w:bookmarkStart w:id="17" w:name="experiments"/>
     <w:p>
       <w:pPr>
         <w:pStyle w:val="Heading2"/>
@@ -576,7 +873,7 @@
         <w:t xml:space="preserve">Experiments</w:t>
       </w:r>
     </w:p>
-    <w:bookmarkStart w:id="12" w:name="regime-definition"/>
+    <w:bookmarkStart w:id="14" w:name="regime-definition"/>
     <w:p>
       <w:pPr>
         <w:pStyle w:val="Heading3"/>
@@ -696,8 +993,8 @@
         <w:t xml:space="preserve">fresh cash. Windows differ by ticker.</w:t>
       </w:r>
     </w:p>
-    <w:bookmarkEnd w:id="12"/>
-    <w:bookmarkStart w:id="13" w:name="protocol-and-results"/>
+    <w:bookmarkEnd w:id="14"/>
+    <w:bookmarkStart w:id="15" w:name="protocol-and-results"/>
     <w:p>
       <w:pPr>
         <w:pStyle w:val="Heading3"/>
@@ -730,480 +1027,41 @@
         <w:t xml:space="preserve"> </w:t>
       </w:r>
       <w:r>
-        <w:t xml:space="preserve">Four frozen runs.</w:t>
-      </w:r>
-    </w:p>
-    <w:tbl>
-      <w:tblPr>
-        <w:tblStyle w:val="Table"/>
-        <w:tblW w:type="pct" w:w="5000"/>
-        <w:tblLayout w:type="fixed"/>
-        <w:tblLook w:firstRow="1" w:lastRow="0" w:firstColumn="0" w:lastColumn="0" w:noHBand="0" w:noVBand="0" w:val="0020"/>
-      </w:tblPr>
-      <w:tblGrid>
-        <w:gridCol w:w="1038"/>
-        <w:gridCol w:w="1038"/>
-        <w:gridCol w:w="1038"/>
-        <w:gridCol w:w="779"/>
-        <w:gridCol w:w="649"/>
-        <w:gridCol w:w="908"/>
-        <w:gridCol w:w="1558"/>
-        <w:gridCol w:w="908"/>
-      </w:tblGrid>
-      <w:tr>
-        <w:trPr>
-          <w:tblHeader w:val="on"/>
-        </w:trPr>
-        <w:tc>
-          <w:tcPr/>
-          <w:p>
-            <w:pPr>
-              <w:pStyle w:val="Compact"/>
-            </w:pPr>
-            <w:r>
-              <w:t xml:space="preserve">Ticker</w:t>
-            </w:r>
-          </w:p>
-        </w:tc>
-        <w:tc>
-          <w:tcPr/>
-          <w:p>
-            <w:pPr>
-              <w:pStyle w:val="Compact"/>
-            </w:pPr>
-            <w:r>
-              <w:t xml:space="preserve">Regime</w:t>
-            </w:r>
-          </w:p>
-        </w:tc>
-        <w:tc>
-          <w:tcPr/>
-          <w:p>
-            <w:pPr>
-              <w:pStyle w:val="Compact"/>
-            </w:pPr>
-            <w:r>
-              <w:t xml:space="preserve">Window</w:t>
-            </w:r>
-          </w:p>
-        </w:tc>
-        <w:tc>
-          <w:tcPr/>
-          <w:p>
-            <w:pPr>
-              <w:pStyle w:val="Compact"/>
-            </w:pPr>
-            <w:r>
-              <w:t xml:space="preserve">Days</w:t>
-            </w:r>
-          </w:p>
-        </w:tc>
-        <w:tc>
-          <w:tcPr/>
-          <w:p>
-            <w:pPr>
-              <w:pStyle w:val="Compact"/>
-            </w:pPr>
-            <w:r>
-              <w:t xml:space="preserve">B&amp;H</w:t>
-            </w:r>
-          </w:p>
-        </w:tc>
-        <w:tc>
-          <w:tcPr/>
-          <w:p>
-            <w:pPr>
-              <w:pStyle w:val="Compact"/>
-            </w:pPr>
-            <w:r>
-              <w:t xml:space="preserve">Agent</w:t>
-            </w:r>
-          </w:p>
-        </w:tc>
-        <w:tc>
-          <w:tcPr/>
-          <w:p>
-            <w:pPr>
-              <w:pStyle w:val="Compact"/>
-            </w:pPr>
-            <w:r>
-              <w:t xml:space="preserve">End equity</w:t>
-            </w:r>
-          </w:p>
-        </w:tc>
-        <w:tc>
-          <w:tcPr/>
-          <w:p>
-            <w:pPr>
-              <w:pStyle w:val="Compact"/>
-            </w:pPr>
-            <w:r>
-              <w:t xml:space="preserve">B/H/S</w:t>
-            </w:r>
-          </w:p>
-        </w:tc>
-      </w:tr>
-      <w:tr>
-        <w:tc>
-          <w:tcPr/>
-          <w:p>
-            <w:pPr>
-              <w:pStyle w:val="Compact"/>
-            </w:pPr>
-            <w:r>
-              <w:t xml:space="preserve">RELIANCE</w:t>
-            </w:r>
-          </w:p>
-        </w:tc>
-        <w:tc>
-          <w:tcPr/>
-          <w:p>
-            <w:pPr>
-              <w:pStyle w:val="Compact"/>
-            </w:pPr>
-            <w:r>
-              <w:t xml:space="preserve">Bear</w:t>
-            </w:r>
-          </w:p>
-        </w:tc>
-        <w:tc>
-          <w:tcPr/>
-          <w:p>
-            <w:pPr>
-              <w:pStyle w:val="Compact"/>
-            </w:pPr>
-            <w:r>
-              <w:t xml:space="preserve">2024-08-01 .. 2025-01-03</w:t>
-            </w:r>
-          </w:p>
-        </w:tc>
-        <w:tc>
-          <w:tcPr/>
-          <w:p>
-            <w:pPr>
-              <w:pStyle w:val="Compact"/>
-            </w:pPr>
-            <w:r>
-              <w:t xml:space="preserve">111</w:t>
-            </w:r>
-          </w:p>
-        </w:tc>
-        <w:tc>
-          <w:tcPr/>
-          <w:p>
-            <w:pPr>
-              <w:pStyle w:val="Compact"/>
-            </w:pPr>
-            <w:r>
-              <w:t xml:space="preserve">-17.4%</w:t>
-            </w:r>
-          </w:p>
-        </w:tc>
-        <w:tc>
-          <w:tcPr/>
-          <w:p>
-            <w:pPr>
-              <w:pStyle w:val="Compact"/>
-            </w:pPr>
-            <w:r>
-              <w:t xml:space="preserve">-7.5%</w:t>
-            </w:r>
-          </w:p>
-        </w:tc>
-        <w:tc>
-          <w:tcPr/>
-          <w:p>
-            <w:pPr>
-              <w:pStyle w:val="Compact"/>
-            </w:pPr>
-            <w:r>
-              <w:t xml:space="preserve">92,459</w:t>
-            </w:r>
-          </w:p>
-        </w:tc>
-        <w:tc>
-          <w:tcPr/>
-          <w:p>
-            <w:pPr>
-              <w:pStyle w:val="Compact"/>
-            </w:pPr>
-            <w:r>
-              <w:t xml:space="preserve">7/28/76</w:t>
-            </w:r>
-          </w:p>
-        </w:tc>
-      </w:tr>
-      <w:tr>
-        <w:tc>
-          <w:tcPr/>
-          <w:p>
-            <w:pPr>
-              <w:pStyle w:val="Compact"/>
-            </w:pPr>
-            <w:r>
-              <w:t xml:space="preserve">RELIANCE</w:t>
-            </w:r>
-          </w:p>
-        </w:tc>
-        <w:tc>
-          <w:tcPr/>
-          <w:p>
-            <w:pPr>
-              <w:pStyle w:val="Compact"/>
-            </w:pPr>
-            <w:r>
-              <w:t xml:space="preserve">Bull</w:t>
-            </w:r>
-          </w:p>
-        </w:tc>
-        <w:tc>
-          <w:tcPr/>
-          <w:p>
-            <w:pPr>
-              <w:pStyle w:val="Compact"/>
-            </w:pPr>
-            <w:r>
-              <w:t xml:space="preserve">2025-01-01 .. 2025-06-03</w:t>
-            </w:r>
-          </w:p>
-        </w:tc>
-        <w:tc>
-          <w:tcPr/>
-          <w:p>
-            <w:pPr>
-              <w:pStyle w:val="Compact"/>
-            </w:pPr>
-            <w:r>
-              <w:t xml:space="preserve">108</w:t>
-            </w:r>
-          </w:p>
-        </w:tc>
-        <w:tc>
-          <w:tcPr/>
-          <w:p>
-            <w:pPr>
-              <w:pStyle w:val="Compact"/>
-            </w:pPr>
-            <w:r>
-              <w:t xml:space="preserve">+15.1%</w:t>
-            </w:r>
-          </w:p>
-        </w:tc>
-        <w:tc>
-          <w:tcPr/>
-          <w:p>
-            <w:pPr>
-              <w:pStyle w:val="Compact"/>
-            </w:pPr>
-            <w:r>
-              <w:t xml:space="preserve">+5.6%</w:t>
-            </w:r>
-          </w:p>
-        </w:tc>
-        <w:tc>
-          <w:tcPr/>
-          <w:p>
-            <w:pPr>
-              <w:pStyle w:val="Compact"/>
-            </w:pPr>
-            <w:r>
-              <w:t xml:space="preserve">105,559</w:t>
-            </w:r>
-          </w:p>
-        </w:tc>
-        <w:tc>
-          <w:tcPr/>
-          <w:p>
-            <w:pPr>
-              <w:pStyle w:val="Compact"/>
-            </w:pPr>
-            <w:r>
-              <w:t xml:space="preserve">9/25/74</w:t>
-            </w:r>
-          </w:p>
-        </w:tc>
-      </w:tr>
-      <w:tr>
-        <w:tc>
-          <w:tcPr/>
-          <w:p>
-            <w:pPr>
-              <w:pStyle w:val="Compact"/>
-            </w:pPr>
-            <w:r>
-              <w:t xml:space="preserve">TCS</w:t>
-            </w:r>
-          </w:p>
-        </w:tc>
-        <w:tc>
-          <w:tcPr/>
-          <w:p>
-            <w:pPr>
-              <w:pStyle w:val="Compact"/>
-            </w:pPr>
-            <w:r>
-              <w:t xml:space="preserve">Bear</w:t>
-            </w:r>
-          </w:p>
-        </w:tc>
-        <w:tc>
-          <w:tcPr/>
-          <w:p>
-            <w:pPr>
-              <w:pStyle w:val="Compact"/>
-            </w:pPr>
-            <w:r>
-              <w:t xml:space="preserve">2024-12-02 .. 2025-04-03</w:t>
-            </w:r>
-          </w:p>
-        </w:tc>
-        <w:tc>
-          <w:tcPr/>
-          <w:p>
-            <w:pPr>
-              <w:pStyle w:val="Compact"/>
-            </w:pPr>
-            <w:r>
-              <w:t xml:space="preserve">88</w:t>
-            </w:r>
-          </w:p>
-        </w:tc>
-        <w:tc>
-          <w:tcPr/>
-          <w:p>
-            <w:pPr>
-              <w:pStyle w:val="Compact"/>
-            </w:pPr>
-            <w:r>
-              <w:t xml:space="preserve">-20.4%</w:t>
-            </w:r>
-          </w:p>
-        </w:tc>
-        <w:tc>
-          <w:tcPr/>
-          <w:p>
-            <w:pPr>
-              <w:pStyle w:val="Compact"/>
-            </w:pPr>
-            <w:r>
-              <w:t xml:space="preserve">-4.8%</w:t>
-            </w:r>
-          </w:p>
-        </w:tc>
-        <w:tc>
-          <w:tcPr/>
-          <w:p>
-            <w:pPr>
-              <w:pStyle w:val="Compact"/>
-            </w:pPr>
-            <w:r>
-              <w:t xml:space="preserve">95,166</w:t>
-            </w:r>
-          </w:p>
-        </w:tc>
-        <w:tc>
-          <w:tcPr/>
-          <w:p>
-            <w:pPr>
-              <w:pStyle w:val="Compact"/>
-            </w:pPr>
-            <w:r>
-              <w:t xml:space="preserve">12/24/52</w:t>
-            </w:r>
-          </w:p>
-        </w:tc>
-      </w:tr>
-      <w:tr>
-        <w:tc>
-          <w:tcPr/>
-          <w:p>
-            <w:pPr>
-              <w:pStyle w:val="Compact"/>
-            </w:pPr>
-            <w:r>
-              <w:t xml:space="preserve">TCS</w:t>
-            </w:r>
-          </w:p>
-        </w:tc>
-        <w:tc>
-          <w:tcPr/>
-          <w:p>
-            <w:pPr>
-              <w:pStyle w:val="Compact"/>
-            </w:pPr>
-            <w:r>
-              <w:t xml:space="preserve">Bull</w:t>
-            </w:r>
-          </w:p>
-        </w:tc>
-        <w:tc>
-          <w:tcPr/>
-          <w:p>
-            <w:pPr>
-              <w:pStyle w:val="Compact"/>
-            </w:pPr>
-            <w:r>
-              <w:t xml:space="preserve">2024-06-03 .. 2024-09-03</w:t>
-            </w:r>
-          </w:p>
-        </w:tc>
-        <w:tc>
-          <w:tcPr/>
-          <w:p>
-            <w:pPr>
-              <w:pStyle w:val="Compact"/>
-            </w:pPr>
-            <w:r>
-              <w:t xml:space="preserve">67</w:t>
-            </w:r>
-          </w:p>
-        </w:tc>
-        <w:tc>
-          <w:tcPr/>
-          <w:p>
-            <w:pPr>
-              <w:pStyle w:val="Compact"/>
-            </w:pPr>
-            <w:r>
-              <w:t xml:space="preserve">+21.9%</w:t>
-            </w:r>
-          </w:p>
-        </w:tc>
-        <w:tc>
-          <w:tcPr/>
-          <w:p>
-            <w:pPr>
-              <w:pStyle w:val="Compact"/>
-            </w:pPr>
-            <w:r>
-              <w:t xml:space="preserve">+19.6%</w:t>
-            </w:r>
-          </w:p>
-        </w:tc>
-        <w:tc>
-          <w:tcPr/>
-          <w:p>
-            <w:pPr>
-              <w:pStyle w:val="Compact"/>
-            </w:pPr>
-            <w:r>
-              <w:t xml:space="preserve">119,607</w:t>
-            </w:r>
-          </w:p>
-        </w:tc>
-        <w:tc>
-          <w:tcPr/>
-          <w:p>
-            <w:pPr>
-              <w:pStyle w:val="Compact"/>
-            </w:pPr>
-            <w:r>
-              <w:t xml:space="preserve">13/14/40</w:t>
-            </w:r>
-          </w:p>
-        </w:tc>
-      </w:tr>
-    </w:tbl>
+        <w:t xml:space="preserve">Four frozen runs. Sharpe is computed on</w:t>
+      </w:r>
+      <w:r>
+        <w:t xml:space="preserve"> </w:t>
+      </w:r>
+      <w:r>
+        <w:rPr>
+          <w:b/>
+          <w:bCs/>
+        </w:rPr>
+        <w:t xml:space="preserve">agent</w:t>
+      </w:r>
+      <w:r>
+        <w:t xml:space="preserve"> </w:t>
+      </w:r>
+      <w:r>
+        <w:t xml:space="preserve">daily equity returns (annualized; see footnote in Section 3.4;</w:t>
+      </w:r>
+      <w:r>
+        <w:t xml:space="preserve"> </w:t>
+      </w:r>
+      <w:r>
+        <w:rPr>
+          <w:b/>
+          <w:bCs/>
+        </w:rPr>
+        <w:t xml:space="preserve">no risk-free rate</w:t>
+      </w:r>
+      <w:r>
+        <w:t xml:space="preserve"> </w:t>
+      </w:r>
+      <w:r>
+        <w:t xml:space="preserve">subtracted).</w:t>
+      </w:r>
+    </w:p>
     <w:p>
       <w:pPr>
         <w:pStyle w:val="BodyText"/>
@@ -1219,7 +1077,39 @@
         <w:t xml:space="preserve"> </w:t>
       </w:r>
       <w:r>
-        <w:t xml:space="preserve">agent loses less than buy-and-hold.</w:t>
+        <w:t xml:space="preserve">agent loses less than buy-and-hold on</w:t>
+      </w:r>
+      <w:r>
+        <w:t xml:space="preserve"> </w:t>
+      </w:r>
+      <w:r>
+        <w:rPr>
+          <w:b/>
+          <w:bCs/>
+        </w:rPr>
+        <w:t xml:space="preserve">total return</w:t>
+      </w:r>
+      <w:r>
+        <w:t xml:space="preserve"> </w:t>
+      </w:r>
+      <w:r>
+        <w:t xml:space="preserve">and shows</w:t>
+      </w:r>
+      <w:r>
+        <w:t xml:space="preserve"> </w:t>
+      </w:r>
+      <w:r>
+        <w:rPr>
+          <w:b/>
+          <w:bCs/>
+        </w:rPr>
+        <w:t xml:space="preserve">lower path drawdown</w:t>
+      </w:r>
+      <w:r>
+        <w:t xml:space="preserve"> </w:t>
+      </w:r>
+      <w:r>
+        <w:t xml:space="preserve">(e.g., RELIANCE bear: agent MDD 5.1% vs B&amp;H MDD 21.0%), consistent with SELL-heavy signals and reduced long exposure.</w:t>
       </w:r>
       <w:r>
         <w:t xml:space="preserve"> </w:t>
@@ -1235,11 +1125,27 @@
         <w:t xml:space="preserve"> </w:t>
       </w:r>
       <w:r>
-        <w:t xml:space="preserve">RELIANCE lags B&amp;H; TCS nearly tracks B&amp;H. Final signals remain SELL-heavy in most runs.</w:t>
-      </w:r>
-    </w:p>
-    <w:bookmarkEnd w:id="13"/>
-    <w:bookmarkStart w:id="26" w:name="figures"/>
+        <w:t xml:space="preserve">RELIANCE lags B&amp;H; TCS nearly tracks B&amp;H.</w:t>
+      </w:r>
+      <w:r>
+        <w:t xml:space="preserve"> </w:t>
+      </w:r>
+      <w:r>
+        <w:rPr>
+          <w:b/>
+          <w:bCs/>
+        </w:rPr>
+        <w:t xml:space="preserve">Sharpe</w:t>
+      </w:r>
+      <w:r>
+        <w:t xml:space="preserve"> </w:t>
+      </w:r>
+      <w:r>
+        <w:t xml:space="preserve">is negative in three of four runs—including RELIANCE bull (+5.6% return)—because daily equity volatility dominates on short windows; only TCS bull is Sharpe-positive (+4.25). Interpret Sharpe alongside total return and MDD, not in isolation.</w:t>
+      </w:r>
+    </w:p>
+    <w:bookmarkEnd w:id="15"/>
+    <w:bookmarkStart w:id="16" w:name="figures"/>
     <w:p>
       <w:pPr>
         <w:pStyle w:val="Heading3"/>
@@ -1257,229 +1163,9 @@
         <w:t xml:space="preserve">Figures</w:t>
       </w:r>
     </w:p>
-    <w:p>
-      <w:pPr>
-        <w:pStyle w:val="CaptionedFigure"/>
-      </w:pPr>
-      <w:r>
-        <w:drawing>
-          <wp:inline>
-            <wp:extent cx="5334000" cy="3639084"/>
-            <wp:effectExtent b="0" l="0" r="0" t="0"/>
-            <wp:docPr descr="Figure 1. Agent vs buy-and-hold equity (2x2 grid)." title="" id="15" name="Picture"/>
-            <a:graphic>
-              <a:graphicData uri="http://schemas.openxmlformats.org/drawingml/2006/picture">
-                <pic:pic>
-                  <pic:nvPicPr>
-                    <pic:cNvPr descr="figures/fig_regime_equity_grid.pdf" id="16" name="Picture"/>
-                    <pic:cNvPicPr>
-                      <a:picLocks noChangeArrowheads="1" noChangeAspect="1"/>
-                    </pic:cNvPicPr>
-                  </pic:nvPicPr>
-                  <pic:blipFill>
-                    <a:blip r:embed="rId14"/>
-                    <a:stretch>
-                      <a:fillRect/>
-                    </a:stretch>
-                  </pic:blipFill>
-                  <pic:spPr bwMode="auto">
-                    <a:xfrm>
-                      <a:off x="0" y="0"/>
-                      <a:ext cx="5334000" cy="3639084"/>
-                    </a:xfrm>
-                    <a:prstGeom prst="rect">
-                      <a:avLst/>
-                    </a:prstGeom>
-                    <a:noFill/>
-                    <a:ln w="9525">
-                      <a:noFill/>
-                      <a:headEnd/>
-                      <a:tailEnd/>
-                    </a:ln>
-                  </pic:spPr>
-                </pic:pic>
-              </a:graphicData>
-            </a:graphic>
-          </wp:inline>
-        </w:drawing>
-      </w:r>
-    </w:p>
-    <w:p>
-      <w:pPr>
-        <w:pStyle w:val="ImageCaption"/>
-      </w:pPr>
-      <w:r>
-        <w:t xml:space="preserve">Figure 1. Agent vs buy-and-hold equity (2x2 grid).</w:t>
-      </w:r>
-    </w:p>
-    <w:p>
-      <w:pPr>
-        <w:pStyle w:val="CaptionedFigure"/>
-      </w:pPr>
-      <w:r>
-        <w:drawing>
-          <wp:inline>
-            <wp:extent cx="5334000" cy="2217505"/>
-            <wp:effectExtent b="0" l="0" r="0" t="0"/>
-            <wp:docPr descr="Figure 2. Total returns (four runs)." title="" id="18" name="Picture"/>
-            <a:graphic>
-              <a:graphicData uri="http://schemas.openxmlformats.org/drawingml/2006/picture">
-                <pic:pic>
-                  <pic:nvPicPr>
-                    <pic:cNvPr descr="figures/fig_regime_returns_by_ticker.pdf" id="19" name="Picture"/>
-                    <pic:cNvPicPr>
-                      <a:picLocks noChangeArrowheads="1" noChangeAspect="1"/>
-                    </pic:cNvPicPr>
-                  </pic:nvPicPr>
-                  <pic:blipFill>
-                    <a:blip r:embed="rId17"/>
-                    <a:stretch>
-                      <a:fillRect/>
-                    </a:stretch>
-                  </pic:blipFill>
-                  <pic:spPr bwMode="auto">
-                    <a:xfrm>
-                      <a:off x="0" y="0"/>
-                      <a:ext cx="5334000" cy="2217505"/>
-                    </a:xfrm>
-                    <a:prstGeom prst="rect">
-                      <a:avLst/>
-                    </a:prstGeom>
-                    <a:noFill/>
-                    <a:ln w="9525">
-                      <a:noFill/>
-                      <a:headEnd/>
-                      <a:tailEnd/>
-                    </a:ln>
-                  </pic:spPr>
-                </pic:pic>
-              </a:graphicData>
-            </a:graphic>
-          </wp:inline>
-        </w:drawing>
-      </w:r>
-    </w:p>
-    <w:p>
-      <w:pPr>
-        <w:pStyle w:val="ImageCaption"/>
-      </w:pPr>
-      <w:r>
-        <w:t xml:space="preserve">Figure 2. Total returns (four runs).</w:t>
-      </w:r>
-    </w:p>
-    <w:p>
-      <w:pPr>
-        <w:pStyle w:val="CaptionedFigure"/>
-      </w:pPr>
-      <w:r>
-        <w:drawing>
-          <wp:inline>
-            <wp:extent cx="5334000" cy="2217505"/>
-            <wp:effectExtent b="0" l="0" r="0" t="0"/>
-            <wp:docPr descr="Figure 3. Signal counts." title="" id="21" name="Picture"/>
-            <a:graphic>
-              <a:graphicData uri="http://schemas.openxmlformats.org/drawingml/2006/picture">
-                <pic:pic>
-                  <pic:nvPicPr>
-                    <pic:cNvPr descr="figures/fig_regime_signals_by_ticker.pdf" id="22" name="Picture"/>
-                    <pic:cNvPicPr>
-                      <a:picLocks noChangeArrowheads="1" noChangeAspect="1"/>
-                    </pic:cNvPicPr>
-                  </pic:nvPicPr>
-                  <pic:blipFill>
-                    <a:blip r:embed="rId20"/>
-                    <a:stretch>
-                      <a:fillRect/>
-                    </a:stretch>
-                  </pic:blipFill>
-                  <pic:spPr bwMode="auto">
-                    <a:xfrm>
-                      <a:off x="0" y="0"/>
-                      <a:ext cx="5334000" cy="2217505"/>
-                    </a:xfrm>
-                    <a:prstGeom prst="rect">
-                      <a:avLst/>
-                    </a:prstGeom>
-                    <a:noFill/>
-                    <a:ln w="9525">
-                      <a:noFill/>
-                      <a:headEnd/>
-                      <a:tailEnd/>
-                    </a:ln>
-                  </pic:spPr>
-                </pic:pic>
-              </a:graphicData>
-            </a:graphic>
-          </wp:inline>
-        </w:drawing>
-      </w:r>
-    </w:p>
-    <w:p>
-      <w:pPr>
-        <w:pStyle w:val="ImageCaption"/>
-      </w:pPr>
-      <w:r>
-        <w:t xml:space="preserve">Figure 3. Signal counts.</w:t>
-      </w:r>
-    </w:p>
-    <w:p>
-      <w:pPr>
-        <w:pStyle w:val="CaptionedFigure"/>
-      </w:pPr>
-      <w:r>
-        <w:drawing>
-          <wp:inline>
-            <wp:extent cx="5334000" cy="2184000"/>
-            <wp:effectExtent b="0" l="0" r="0" t="0"/>
-            <wp:docPr descr="Figure 4. Bullish analyst-outlook share." title="" id="24" name="Picture"/>
-            <a:graphic>
-              <a:graphicData uri="http://schemas.openxmlformats.org/drawingml/2006/picture">
-                <pic:pic>
-                  <pic:nvPicPr>
-                    <pic:cNvPr descr="figures/fig_regime_outlook_bullish.pdf" id="25" name="Picture"/>
-                    <pic:cNvPicPr>
-                      <a:picLocks noChangeArrowheads="1" noChangeAspect="1"/>
-                    </pic:cNvPicPr>
-                  </pic:nvPicPr>
-                  <pic:blipFill>
-                    <a:blip r:embed="rId23"/>
-                    <a:stretch>
-                      <a:fillRect/>
-                    </a:stretch>
-                  </pic:blipFill>
-                  <pic:spPr bwMode="auto">
-                    <a:xfrm>
-                      <a:off x="0" y="0"/>
-                      <a:ext cx="5334000" cy="2184000"/>
-                    </a:xfrm>
-                    <a:prstGeom prst="rect">
-                      <a:avLst/>
-                    </a:prstGeom>
-                    <a:noFill/>
-                    <a:ln w="9525">
-                      <a:noFill/>
-                      <a:headEnd/>
-                      <a:tailEnd/>
-                    </a:ln>
-                  </pic:spPr>
-                </pic:pic>
-              </a:graphicData>
-            </a:graphic>
-          </wp:inline>
-        </w:drawing>
-      </w:r>
-    </w:p>
-    <w:p>
-      <w:pPr>
-        <w:pStyle w:val="ImageCaption"/>
-      </w:pPr>
-      <w:r>
-        <w:t xml:space="preserve">Figure 4. Bullish analyst-outlook share.</w:t>
-      </w:r>
-    </w:p>
-    <w:bookmarkEnd w:id="26"/>
-    <w:bookmarkEnd w:id="27"/>
-    <w:bookmarkStart w:id="28" w:name="conclusion"/>
+    <w:bookmarkEnd w:id="16"/>
+    <w:bookmarkEnd w:id="17"/>
+    <w:bookmarkStart w:id="18" w:name="conclusion"/>
     <w:p>
       <w:pPr>
         <w:pStyle w:val="Heading2"/>
@@ -1518,7 +1204,20 @@
         <w:t xml:space="preserve"> </w:t>
       </w:r>
       <w:r>
-        <w:t xml:space="preserve">evaluation. Bear windows show relative downside protection; bull outcomes are heterogeneous.</w:t>
+        <w:t xml:space="preserve">evaluation. Bear windows show relative downside protection on both</w:t>
+      </w:r>
+      <w:r>
+        <w:t xml:space="preserve"> </w:t>
+      </w:r>
+      <w:r>
+        <w:rPr>
+          <w:b/>
+          <w:bCs/>
+        </w:rPr>
+        <w:t xml:space="preserve">return and drawdown</w:t>
+      </w:r>
+      <w:r>
+        <w:t xml:space="preserve">; bull outcomes are heterogeneous.</w:t>
       </w:r>
       <w:r>
         <w:t xml:space="preserve"> </w:t>
@@ -1534,11 +1233,11 @@
         <w:t xml:space="preserve"> </w:t>
       </w:r>
       <w:r>
-        <w:t xml:space="preserve">two tickers, per-ticker calendars, one LLM.</w:t>
-      </w:r>
-    </w:p>
-    <w:bookmarkEnd w:id="28"/>
-    <w:bookmarkStart w:id="29" w:name="contributions"/>
+        <w:t xml:space="preserve">two tickers, per-ticker calendars, one LLM; anonymization enabled but not ablated; Sharpe without a risk-free benchmark and on short windows.</w:t>
+      </w:r>
+    </w:p>
+    <w:bookmarkEnd w:id="18"/>
+    <w:bookmarkStart w:id="19" w:name="contributions"/>
     <w:p>
       <w:pPr>
         <w:pStyle w:val="Heading2"/>
@@ -1616,8 +1315,8 @@
         <w:t xml:space="preserve">Backtest harness and analysis artifacts.</w:t>
       </w:r>
     </w:p>
-    <w:bookmarkEnd w:id="29"/>
-    <w:bookmarkStart w:id="30" w:name="acknowledgements"/>
+    <w:bookmarkEnd w:id="19"/>
+    <w:bookmarkStart w:id="20" w:name="acknowledgements"/>
     <w:p>
       <w:pPr>
         <w:pStyle w:val="Heading2"/>
@@ -1631,11 +1330,27 @@
         <w:pStyle w:val="FirstParagraph"/>
       </w:pPr>
       <w:r>
-        <w:t xml:space="preserve">Not applicable.</w:t>
-      </w:r>
-    </w:p>
-    <w:bookmarkEnd w:id="30"/>
-    <w:bookmarkStart w:id="31" w:name="references"/>
+        <w:t xml:space="preserve">The agent graph implementation builds on</w:t>
+      </w:r>
+      <w:r>
+        <w:t xml:space="preserve"> </w:t>
+      </w:r>
+      <w:r>
+        <w:rPr>
+          <w:b/>
+          <w:bCs/>
+        </w:rPr>
+        <w:t xml:space="preserve">TradingAgents</w:t>
+      </w:r>
+      <w:r>
+        <w:t xml:space="preserve"> </w:t>
+      </w:r>
+      <w:r>
+        <w:t xml:space="preserve">(Xiao et al., 2024; Tauric Research, Apache License 2.0). We thank the authors for open-sourcing the framework.</w:t>
+      </w:r>
+    </w:p>
+    <w:bookmarkEnd w:id="20"/>
+    <w:bookmarkStart w:id="21" w:name="references"/>
     <w:p>
       <w:pPr>
         <w:pStyle w:val="Heading2"/>
@@ -1716,7 +1431,7 @@
         <w:t xml:space="preserve">arXiv:2311.13743 [q-fin.CP]. Available at: https://arxiv.org/abs/2311.13743 (Accessed: 29 May 2026).</w:t>
       </w:r>
     </w:p>
-    <w:bookmarkEnd w:id="31"/>
+    <w:bookmarkEnd w:id="21"/>
     <w:sectPr>
       <w:footnotePr>
         <w:numRestart w:val="eachSect"/>

</xml_diff>

<commit_message>
fix: added github link to paper
</commit_message>
<xml_diff>
--- a/docs/paper/submission/Hindsight2020_AlgorithmicFinance_IOS_submission.docx
+++ b/docs/paper/submission/Hindsight2020_AlgorithmicFinance_IOS_submission.docx
@@ -192,7 +192,7 @@
         <w:t xml:space="preserve">bull windows</w:t>
       </w:r>
       <w:r>
-        <w:t xml:space="preserve">, outcomes diverge (RELIANCE lags B&amp;H; TCS nearly tracks it). Frozen CSV artifacts reproduce tables and figures.</w:t>
+        <w:t xml:space="preserve">, outcomes diverge (RELIANCE lags B&amp;H; TCS nearly tracks it). Frozen CSV artifacts reproduce tables and figures. Code and artifacts: https://github.com/RMartires/hindsight</w:t>
       </w:r>
     </w:p>
     <w:p>
@@ -361,7 +361,13 @@
         <w:t xml:space="preserve"> </w:t>
       </w:r>
       <w:r>
-        <w:t xml:space="preserve">in four independent runs (bear and bull per ticker). Section 2 surveys related work; Section 3 the system; Section 4 results; Section 5 concludes; Section 6 lists contributions.</w:t>
+        <w:t xml:space="preserve">in four independent runs (bear and bull per ticker). The implementation, frozen evaluation artifacts, and figure scripts are available at</w:t>
+      </w:r>
+      <w:r>
+        <w:t xml:space="preserve"> </w:t>
+      </w:r>
+      <w:r>
+        <w:t xml:space="preserve">. Section 2 surveys related work; Section 3 the system; Section 4 results; Section 5 concludes; Section 6 lists contributions.</w:t>
       </w:r>
     </w:p>
     <w:bookmarkEnd w:id="9"/>

</xml_diff>

<commit_message>
fix: added paper improvements
</commit_message>
<xml_diff>
--- a/docs/paper/submission/Hindsight2020_AlgorithmicFinance_IOS_submission.docx
+++ b/docs/paper/submission/Hindsight2020_AlgorithmicFinance_IOS_submission.docx
@@ -7,7 +7,7 @@
         <w:pStyle w:val="Title"/>
       </w:pPr>
       <w:r>
-        <w:t xml:space="preserve">Point-in-Time Multi-Agent LLM Trading: A Reproducible LangGraph Stack with Regime-Conditioned Evaluation and Fair Backtesting</w:t>
+        <w:t xml:space="preserve">Point-in-Time Multi-Agent LLM Trading: A Reproducible LangGraph Stack with Regime-Conditioned Case Study Evaluation and Fair Backtesting</w:t>
       </w:r>
     </w:p>
     <w:p>
@@ -31,7 +31,7 @@
         <w:pStyle w:val="Abstract"/>
       </w:pPr>
       <w:r>
-        <w:t xml:space="preserve">Large language models are increasingly used in financial decision pipelines, yet published agent stacks are often hard to reproduce and rarely evaluated under distinct market conditions on historical as-of dates. We present</w:t>
+        <w:t xml:space="preserve">Published LLM trading stacks are often hard to reproduce, rarely enforce temporal data boundaries, and seldom report net returns after fees. We present</w:t>
       </w:r>
       <w:r>
         <w:t xml:space="preserve"> </w:t>
@@ -102,7 +102,7 @@
         <w:t xml:space="preserve">paper backtest</w:t>
       </w:r>
       <w:r>
-        <w:t xml:space="preserve">. We evaluate the</w:t>
+        <w:t xml:space="preserve">. The primary contribution is reproducible systems engineering with frozen CSV artifacts—not a universe-scale alpha benchmark. As an illustrative case study, we evaluate the</w:t>
       </w:r>
       <w:r>
         <w:t xml:space="preserve"> </w:t>
@@ -160,39 +160,43 @@
           <w:b/>
           <w:bCs/>
         </w:rPr>
-        <w:t xml:space="preserve">exogenous bear and bull windows</w:t>
-      </w:r>
-      <w:r>
-        <w:t xml:space="preserve"> </w:t>
-      </w:r>
-      <w:r>
-        <w:t xml:space="preserve">(per-ticker underlying return at most -10% or at least +10%), each from $100,000 paper cash. In</w:t>
-      </w:r>
-      <w:r>
-        <w:t xml:space="preserve"> </w:t>
-      </w:r>
-      <w:r>
-        <w:rPr>
-          <w:b/>
-          <w:bCs/>
-        </w:rPr>
-        <w:t xml:space="preserve">both bear windows</w:t>
-      </w:r>
-      <w:r>
-        <w:t xml:space="preserve">, the agent loses less than buy-and-hold; in</w:t>
-      </w:r>
-      <w:r>
-        <w:t xml:space="preserve"> </w:t>
-      </w:r>
-      <w:r>
-        <w:rPr>
-          <w:b/>
-          <w:bCs/>
-        </w:rPr>
-        <w:t xml:space="preserve">bull windows</w:t>
-      </w:r>
-      <w:r>
-        <w:t xml:space="preserve">, outcomes diverge (RELIANCE lags B&amp;H; TCS nearly tracks it). Frozen CSV artifacts reproduce tables and figures. Code and artifacts: https://github.com/RMartires/hindsight</w:t>
+        <w:t xml:space="preserve">four pre-specified regime windows</w:t>
+      </w:r>
+      <w:r>
+        <w:t xml:space="preserve"> </w:t>
+      </w:r>
+      <w:r>
+        <w:t xml:space="preserve">(two tickers</w:t>
+      </w:r>
+      <w:r>
+        <w:t xml:space="preserve"> </w:t>
+      </w:r>
+      <m:oMath>
+        <m:r>
+          <m:rPr>
+            <m:sty m:val="p"/>
+          </m:rPr>
+          <m:t>×</m:t>
+        </m:r>
+      </m:oMath>
+      <w:r>
+        <w:t xml:space="preserve"> </w:t>
+      </w:r>
+      <w:r>
+        <w:t xml:space="preserve">exogenous bear/bull labels;</w:t>
+      </w:r>
+      <w:r>
+        <w:t xml:space="preserve"> </w:t>
+      </w:r>
+      <w:r>
+        <w:rPr>
+          <w:b/>
+          <w:bCs/>
+        </w:rPr>
+        <w:t xml:space="preserve">one trajectory per window</w:t>
+      </w:r>
+      <w:r>
+        <w:t xml:space="preserve">, no seed averaging). In both bear windows, the agent loses less than buy-and-hold with lower drawdown; bull outcomes diverge (RELIANCE lags B&amp;H; TCS nearly tracks it). We interpret heterogeneous bull results as an architectural boundary of defensive multi-stage coordination. Code: https://github.com/RMartires/hindsight</w:t>
       </w:r>
     </w:p>
     <w:p>
@@ -236,7 +240,16 @@
         <w:pStyle w:val="FirstParagraph"/>
       </w:pPr>
       <w:r>
-        <w:t xml:space="preserve">Researchers are experimenting with LLMs inside trading workflows, but rarely report how the</w:t>
+        <w:t xml:space="preserve">Researchers are experimenting with LLMs inside trading workflows amid rapid growth in LLM-driven agent systems (B</w:t>
+      </w:r>
+      <w:r>
+        <w:t xml:space="preserve">dic</w:t>
+      </w:r>
+      <w:r>
+        <w:t xml:space="preserve"> </w:t>
+      </w:r>
+      <w:r>
+        <w:t xml:space="preserve">et al., 2025), but rarely report how the</w:t>
       </w:r>
       <w:r>
         <w:t xml:space="preserve"> </w:t>
@@ -265,55 +278,138 @@
         <w:t xml:space="preserve">different underlying trends</w:t>
       </w:r>
       <w:r>
-        <w:t xml:space="preserve"> </w:t>
-      </w:r>
-      <w:r>
-        <w:t xml:space="preserve">or</w:t>
-      </w:r>
-      <w:r>
-        <w:t xml:space="preserve"> </w:t>
-      </w:r>
-      <w:r>
-        <w:rPr>
-          <w:b/>
-          <w:bCs/>
-        </w:rPr>
-        <w:t xml:space="preserve">more than one issuer</w:t>
+        <w:t xml:space="preserve">, enforce point-in-time data at the adapter layer, or report</w:t>
+      </w:r>
+      <w:r>
+        <w:t xml:space="preserve"> </w:t>
+      </w:r>
+      <w:r>
+        <w:rPr>
+          <w:b/>
+          <w:bCs/>
+        </w:rPr>
+        <w:t xml:space="preserve">net</w:t>
+      </w:r>
+      <w:r>
+        <w:t xml:space="preserve"> </w:t>
+      </w:r>
+      <w:r>
+        <w:t xml:space="preserve">returns after stated fees.</w:t>
+      </w:r>
+    </w:p>
+    <w:p>
+      <w:pPr>
+        <w:pStyle w:val="BodyText"/>
+      </w:pPr>
+      <w:r>
+        <w:rPr>
+          <w:b/>
+          <w:bCs/>
+        </w:rPr>
+        <w:t xml:space="preserve">What this paper is.</w:t>
+      </w:r>
+      <w:r>
+        <w:t xml:space="preserve"> </w:t>
+      </w:r>
+      <w:r>
+        <w:rPr>
+          <w:b/>
+          <w:bCs/>
+        </w:rPr>
+        <w:t xml:space="preserve">Hindsight 20/20</w:t>
+      </w:r>
+      <w:r>
+        <w:t xml:space="preserve"> </w:t>
+      </w:r>
+      <w:r>
+        <w:t xml:space="preserve">extends</w:t>
+      </w:r>
+      <w:r>
+        <w:t xml:space="preserve"> </w:t>
+      </w:r>
+      <w:r>
+        <w:rPr>
+          <w:b/>
+          <w:bCs/>
+        </w:rPr>
+        <w:t xml:space="preserve">TradingAgents</w:t>
+      </w:r>
+      <w:r>
+        <w:t xml:space="preserve"> </w:t>
+      </w:r>
+      <w:r>
+        <w:t xml:space="preserve">(Xiao et al., 2024) with schema-constrained outputs, a simulation end date, optional ticker anonymization, and a scriptable fee-aware backtest tied to</w:t>
+      </w:r>
+      <w:r>
+        <w:t xml:space="preserve"> </w:t>
+      </w:r>
+      <w:r>
+        <w:rPr>
+          <w:b/>
+          <w:bCs/>
+        </w:rPr>
+        <w:t xml:space="preserve">frozen CSV artifacts</w:t>
       </w:r>
       <w:r>
         <w:t xml:space="preserve">.</w:t>
       </w:r>
-      <w:r>
-        <w:t xml:space="preserve"> </w:t>
-      </w:r>
-      <w:r>
-        <w:rPr>
-          <w:b/>
-          <w:bCs/>
-        </w:rPr>
-        <w:t xml:space="preserve">Hindsight 20/20</w:t>
-      </w:r>
-      <w:r>
-        <w:t xml:space="preserve"> </w:t>
-      </w:r>
-      <w:r>
-        <w:t xml:space="preserve">extends the open-source</w:t>
-      </w:r>
-      <w:r>
-        <w:t xml:space="preserve"> </w:t>
-      </w:r>
-      <w:r>
-        <w:rPr>
-          <w:b/>
-          <w:bCs/>
-        </w:rPr>
-        <w:t xml:space="preserve">TradingAgents</w:t>
-      </w:r>
-      <w:r>
-        <w:t xml:space="preserve"> </w:t>
-      </w:r>
-      <w:r>
-        <w:t xml:space="preserve">multi-agent LangGraph framework (Xiao et al., 2024) with point-in-time data access, optional ticker anonymization, and a reproducible backtest harness; we evaluate this extended stack under exogenous bear and bull windows. We evaluate the</w:t>
+    </w:p>
+    <w:p>
+      <w:pPr>
+        <w:pStyle w:val="BodyText"/>
+      </w:pPr>
+      <w:r>
+        <w:rPr>
+          <w:b/>
+          <w:bCs/>
+        </w:rPr>
+        <w:t xml:space="preserve">What this paper is not.</w:t>
+      </w:r>
+      <w:r>
+        <w:t xml:space="preserve"> </w:t>
+      </w:r>
+      <w:r>
+        <w:t xml:space="preserve">We do</w:t>
+      </w:r>
+      <w:r>
+        <w:t xml:space="preserve"> </w:t>
+      </w:r>
+      <w:r>
+        <w:rPr>
+          <w:b/>
+          <w:bCs/>
+        </w:rPr>
+        <w:t xml:space="preserve">not</w:t>
+      </w:r>
+      <w:r>
+        <w:t xml:space="preserve"> </w:t>
+      </w:r>
+      <w:r>
+        <w:t xml:space="preserve">claim state-of-the-art risk-adjusted returns, regime prediction, or generalization from a broad universe. Each regime window is</w:t>
+      </w:r>
+      <w:r>
+        <w:t xml:space="preserve"> </w:t>
+      </w:r>
+      <w:r>
+        <w:rPr>
+          <w:b/>
+          <w:bCs/>
+        </w:rPr>
+        <w:t xml:space="preserve">N=1</w:t>
+      </w:r>
+      <w:r>
+        <w:t xml:space="preserve"> </w:t>
+      </w:r>
+      <w:r>
+        <w:t xml:space="preserve">(no multi-seed variance). Frontier benchmarks (Jeon and Lee, 2026; Miyazaki et al., 2026) average many seeds across index universes; our scope is narrower and labeled as such (Section 4.1).</w:t>
+      </w:r>
+    </w:p>
+    <w:p>
+      <w:pPr>
+        <w:pStyle w:val="BodyText"/>
+      </w:pPr>
+      <w:r>
+        <w:t xml:space="preserve">We evaluate the</w:t>
       </w:r>
       <w:r>
         <w:t xml:space="preserve"> </w:t>
@@ -361,13 +457,23 @@
         <w:t xml:space="preserve"> </w:t>
       </w:r>
       <w:r>
-        <w:t xml:space="preserve">in four independent runs (bear and bull per ticker). The implementation, frozen evaluation artifacts, and figure scripts are available at</w:t>
-      </w:r>
-      <w:r>
-        <w:t xml:space="preserve"> </w:t>
-      </w:r>
-      <w:r>
-        <w:t xml:space="preserve">. Section 2 surveys related work; Section 3 the system; Section 4 results; Section 5 concludes; Section 6 lists contributions.</w:t>
+        <w:t xml:space="preserve">in</w:t>
+      </w:r>
+      <w:r>
+        <w:t xml:space="preserve"> </w:t>
+      </w:r>
+      <w:r>
+        <w:rPr>
+          <w:b/>
+          <w:bCs/>
+        </w:rPr>
+        <w:t xml:space="preserve">four pre-specified regime windows</w:t>
+      </w:r>
+      <w:r>
+        <w:t xml:space="preserve"> </w:t>
+      </w:r>
+      <w:r>
+        <w:t xml:space="preserve">(bear and bull per ticker), each from $100,000 paper cash.</w:t>
       </w:r>
     </w:p>
     <w:bookmarkEnd w:id="9"/>
@@ -398,13 +504,70 @@
           <w:b/>
           <w:bCs/>
         </w:rPr>
-        <w:t xml:space="preserve">LLM trading agents</w:t>
-      </w:r>
-      <w:r>
-        <w:t xml:space="preserve"> </w:t>
-      </w:r>
-      <w:r>
-        <w:t xml:space="preserve">motivate multi-role graphs (Xiao et al., 2024; Yu et al., 2023; Yang et al., 2023). We emphasize reproducible engineering: one codepath, schema-constrained outputs, temporal controls, CSV artifacts.</w:t>
+        <w:t xml:space="preserve">LLM agents and classic MAS.</w:t>
+      </w:r>
+      <w:r>
+        <w:t xml:space="preserve"> </w:t>
+      </w:r>
+      <w:r>
+        <w:t xml:space="preserve">Multi-agent trading frameworks orchestrate specialist roles (Xiao et al., 2024; Yu et al., 2023; Yang et al., 2023). B</w:t>
+      </w:r>
+      <w:r>
+        <w:t xml:space="preserve">dic</w:t>
+      </w:r>
+      <w:r>
+        <w:t xml:space="preserve"> </w:t>
+      </w:r>
+      <w:r>
+        <w:t xml:space="preserve">et al. (2025) contrast emergent LLM agents with classic BDI multi-agent systems.</w:t>
+      </w:r>
+      <w:r>
+        <w:t xml:space="preserve"> </w:t>
+      </w:r>
+      <w:r>
+        <w:rPr>
+          <w:b/>
+          <w:bCs/>
+        </w:rPr>
+        <w:t xml:space="preserve">TradingAgents</w:t>
+      </w:r>
+      <w:r>
+        <w:t xml:space="preserve"> </w:t>
+      </w:r>
+      <w:r>
+        <w:t xml:space="preserve">supplies our graph skeleton;</w:t>
+      </w:r>
+      <w:r>
+        <w:t xml:space="preserve"> </w:t>
+      </w:r>
+      <w:r>
+        <w:rPr>
+          <w:b/>
+          <w:bCs/>
+        </w:rPr>
+        <w:t xml:space="preserve">AlphaAgents</w:t>
+      </w:r>
+      <w:r>
+        <w:t xml:space="preserve"> </w:t>
+      </w:r>
+      <w:r>
+        <w:t xml:space="preserve">(Zhao et al., 2025) validates institution-style role separation;</w:t>
+      </w:r>
+      <w:r>
+        <w:t xml:space="preserve"> </w:t>
+      </w:r>
+      <w:r>
+        <w:rPr>
+          <w:b/>
+          <w:bCs/>
+        </w:rPr>
+        <w:t xml:space="preserve">QuantAgents</w:t>
+      </w:r>
+      <w:r>
+        <w:t xml:space="preserve"> </w:t>
+      </w:r>
+      <w:r>
+        <w:t xml:space="preserve">(Li et al., 2025) emphasizes manager-led meetings—comparators for our debate loop, but neither foregrounds adapter-level point-in-time routing or frozen schedule CSVs.</w:t>
       </w:r>
     </w:p>
     <w:p>
@@ -416,13 +579,13 @@
           <w:b/>
           <w:bCs/>
         </w:rPr>
-        <w:t xml:space="preserve">Point-in-time data and leakage</w:t>
-      </w:r>
-      <w:r>
-        <w:t xml:space="preserve"> </w:t>
-      </w:r>
-      <w:r>
-        <w:t xml:space="preserve">require explicit simulation horizons and optional anonymization.</w:t>
+        <w:t xml:space="preserve">Methodological standards and bias control.</w:t>
+      </w:r>
+      <w:r>
+        <w:t xml:space="preserve"> </w:t>
+      </w:r>
+      <w:r>
+        <w:t xml:space="preserve">Nguyen and Pham (2026) propose Consolidated Minimum Standards for LLM financial multi-agent evaluation—contamination control, net-of-cost returns, and regime awareness—and introduce the Coordination Breakeven Spread (CBS). Bailey et al. (2014) warn that undisclosed configuration search makes strong backtests easy to overfit; we respond with pre-specified windows and frozen artifacts. While TradingAgents provides the foundational graph, Hindsight 20/20 implements the point-in-time policy and net-cost ledger those standards recommend.</w:t>
       </w:r>
     </w:p>
     <w:p>
@@ -434,26 +597,67 @@
           <w:b/>
           <w:bCs/>
         </w:rPr>
-        <w:t xml:space="preserve">Regime-split evaluation</w:t>
-      </w:r>
-      <w:r>
-        <w:t xml:space="preserve"> </w:t>
-      </w:r>
-      <w:r>
-        <w:t xml:space="preserve">on the same implementation is uncommon; we report four frozen runs with</w:t>
-      </w:r>
-      <w:r>
-        <w:t xml:space="preserve"> </w:t>
-      </w:r>
-      <w:r>
-        <w:rPr>
-          <w:b/>
-          <w:bCs/>
-        </w:rPr>
-        <w:t xml:space="preserve">per-ticker calendars</w:t>
-      </w:r>
-      <w:r>
-        <w:t xml:space="preserve">, not regime prediction.</w:t>
+        <w:t xml:space="preserve">Anonymization and fine-grained tasks.</w:t>
+      </w:r>
+      <w:r>
+        <w:t xml:space="preserve"> </w:t>
+      </w:r>
+      <w:r>
+        <w:t xml:space="preserve">Jeon and Lee (2026) (</w:t>
+      </w:r>
+      <w:r>
+        <w:rPr>
+          <w:i/>
+          <w:iCs/>
+        </w:rPr>
+        <w:t xml:space="preserve">BlindTrade</w:t>
+      </w:r>
+      <w:r>
+        <w:t xml:space="preserve">) show that identifiers such as</w:t>
+      </w:r>
+      <w:r>
+        <w:t xml:space="preserve"> </w:t>
+      </w:r>
+      <w:r>
+        <w:t xml:space="preserve"> </w:t>
+      </w:r>
+      <w:r>
+        <w:t xml:space="preserve">can trigger memorized pretraining rather than active reasoning; they anonymize S&amp;P~500 names and report Sharpe 1.40,</w:t>
+      </w:r>
+      <m:oMath>
+        <m:r>
+          <m:rPr>
+            <m:sty m:val="p"/>
+          </m:rPr>
+          <m:t>±</m:t>
+        </m:r>
+      </m:oMath>
+      <w:r>
+        <w:t xml:space="preserve">,0.22 across 20 seeds. Hindsight’s optional</w:t>
+      </w:r>
+      <w:r>
+        <w:t xml:space="preserve"> </w:t>
+      </w:r>
+      <w:r>
+        <w:t xml:space="preserve"> </w:t>
+      </w:r>
+      <w:r>
+        <w:t xml:space="preserve">aliases pursue the same goal in a LangGraph replication stack. Miyazaki et al. (2026) prove fine-grained analyst sub-tasks outperform coarse prompts; our analysts are tool-bound to indicators and statements (Section~3.2). Dewansh (2026) defines</w:t>
+      </w:r>
+      <w:r>
+        <w:t xml:space="preserve"> </w:t>
+      </w:r>
+      <w:r>
+        <w:t xml:space="preserve"> </w:t>
+      </w:r>
+      <w:r>
+        <w:t xml:space="preserve">and rationale persistence; our Pydantic stage outputs support audit trails from outlook to</w:t>
+      </w:r>
+      <w:r>
+        <w:t xml:space="preserve"> </w:t>
+      </w:r>
+      <w:r>
+        <w:t xml:space="preserve">.</w:t>
       </w:r>
     </w:p>
     <w:p>
@@ -465,17 +669,55 @@
           <w:b/>
           <w:bCs/>
         </w:rPr>
-        <w:t xml:space="preserve">Execution realism</w:t>
-      </w:r>
-      <w:r>
-        <w:t xml:space="preserve"> </w:t>
-      </w:r>
-      <w:r>
-        <w:t xml:space="preserve">via a paper ledger with stated fees.</w:t>
+        <w:t xml:space="preserve">Benchmarks and simulation realism.</w:t>
+      </w:r>
+      <w:r>
+        <w:t xml:space="preserve"> </w:t>
+      </w:r>
+      <w:r>
+        <w:t xml:space="preserve">Qian et al. (2026) (</w:t>
+      </w:r>
+      <w:r>
+        <w:rPr>
+          <w:i/>
+          <w:iCs/>
+        </w:rPr>
+        <w:t xml:space="preserve">Agent Market Arena</w:t>
+      </w:r>
+      <w:r>
+        <w:t xml:space="preserve">) show agent architecture often matters more than LLM backbone—motivating our fixed-model, regime-varying case study. Papadakis et al. (2025) (</w:t>
+      </w:r>
+      <w:r>
+        <w:rPr>
+          <w:i/>
+          <w:iCs/>
+        </w:rPr>
+        <w:t xml:space="preserve">StockSim</w:t>
+      </w:r>
+      <w:r>
+        <w:t xml:space="preserve">) define order-level simulation with latency and slippage; our candlestick ledger with stated fees is deliberately simpler, with StockSim-class realism as future work.</w:t>
+      </w:r>
+    </w:p>
+    <w:p>
+      <w:pPr>
+        <w:pStyle w:val="BodyText"/>
+      </w:pPr>
+      <w:r>
+        <w:rPr>
+          <w:b/>
+          <w:bCs/>
+        </w:rPr>
+        <w:t xml:space="preserve">Scope contrast.</w:t>
+      </w:r>
+      <w:r>
+        <w:t xml:space="preserve"> </w:t>
+      </w:r>
+      <w:r>
+        <w:t xml:space="preserve">Jeon and Lee (2026), Li et al. (2025), and Miyazaki et al. (2026) stress multi-seed index evaluation; Hindsight stresses reproducible temporal integrity on four pre-specified windows (Table 2).</w:t>
       </w:r>
     </w:p>
     <w:bookmarkEnd w:id="10"/>
-    <w:bookmarkStart w:id="13" w:name="method-system"/>
+    <w:bookmarkStart w:id="14" w:name="method-system"/>
     <w:p>
       <w:pPr>
         <w:pStyle w:val="Heading2"/>
@@ -505,42 +747,58 @@
         <w:t xml:space="preserve">TradingAgentsGraph</w:t>
       </w:r>
       <w:r>
-        <w:t xml:space="preserve"> </w:t>
-      </w:r>
-      <w:r>
-        <w:t xml:space="preserve">composes analysts, bull/bear</w:t>
-      </w:r>
-      <w:r>
-        <w:t xml:space="preserve"> </w:t>
-      </w:r>
-      <w:r>
-        <w:rPr>
-          <w:b/>
-          <w:bCs/>
-        </w:rPr>
-        <w:t xml:space="preserve">debate roles</w:t>
-      </w:r>
-      <w:r>
-        <w:t xml:space="preserve"> </w:t>
-      </w:r>
-      <w:r>
-        <w:t xml:space="preserve">(internal agents, distinct from market regimes), trader, and risk. Core analyst → debate → trader → risk routing follows</w:t>
-      </w:r>
-      <w:r>
-        <w:t xml:space="preserve"> </w:t>
-      </w:r>
-      <w:r>
-        <w:rPr>
-          <w:b/>
-          <w:bCs/>
-        </w:rPr>
-        <w:t xml:space="preserve">TradingAgents</w:t>
-      </w:r>
-      <w:r>
-        <w:t xml:space="preserve"> </w:t>
-      </w:r>
-      <w:r>
-        <w:t xml:space="preserve">(Xiao et al., 2024); our modifications focus on temporal data policy, schema-constrained outputs, and the backtest/evaluation pipeline described below. Section 4 uses</w:t>
+        <w:t xml:space="preserve">: analysts</w:t>
+      </w:r>
+      <w:r>
+        <w:t xml:space="preserve"> </w:t>
+      </w:r>
+      <m:oMath>
+        <m:r>
+          <m:rPr>
+            <m:sty m:val="p"/>
+          </m:rPr>
+          <m:t>→</m:t>
+        </m:r>
+      </m:oMath>
+      <w:r>
+        <w:t xml:space="preserve"> </w:t>
+      </w:r>
+      <w:r>
+        <w:t xml:space="preserve">bull/bear debate</w:t>
+      </w:r>
+      <w:r>
+        <w:t xml:space="preserve"> </w:t>
+      </w:r>
+      <m:oMath>
+        <m:r>
+          <m:rPr>
+            <m:sty m:val="p"/>
+          </m:rPr>
+          <m:t>→</m:t>
+        </m:r>
+      </m:oMath>
+      <w:r>
+        <w:t xml:space="preserve"> </w:t>
+      </w:r>
+      <w:r>
+        <w:t xml:space="preserve">trader</w:t>
+      </w:r>
+      <w:r>
+        <w:t xml:space="preserve"> </w:t>
+      </w:r>
+      <m:oMath>
+        <m:r>
+          <m:rPr>
+            <m:sty m:val="p"/>
+          </m:rPr>
+          <m:t>→</m:t>
+        </m:r>
+      </m:oMath>
+      <w:r>
+        <w:t xml:space="preserve"> </w:t>
+      </w:r>
+      <w:r>
+        <w:t xml:space="preserve">risk. Section 4 uses</w:t>
       </w:r>
       <w:r>
         <w:t xml:space="preserve"> </w:t>
@@ -574,7 +832,7 @@
         <w:t xml:space="preserve">produces wide schedule CSVs.</w:t>
       </w:r>
     </w:p>
-    <w:bookmarkStart w:id="11" w:name="ticker-anonymization"/>
+    <w:bookmarkStart w:id="11" w:name="analyst-task-decomposition"/>
     <w:p>
       <w:pPr>
         <w:pStyle w:val="Heading3"/>
@@ -589,6 +847,290 @@
         <w:tab/>
       </w:r>
       <w:r>
+        <w:t xml:space="preserve">Analyst task decomposition</w:t>
+      </w:r>
+    </w:p>
+    <w:tbl>
+      <w:tblPr>
+        <w:tblStyle w:val="Table"/>
+        <w:tblW w:type="pct" w:w="5000"/>
+        <w:tblLayout w:type="fixed"/>
+        <w:tblLook w:firstRow="1" w:lastRow="0" w:firstColumn="0" w:lastColumn="0" w:noHBand="0" w:noVBand="0" w:val="0020"/>
+      </w:tblPr>
+      <w:tblGrid>
+        <w:gridCol w:w="2640"/>
+        <w:gridCol w:w="2640"/>
+        <w:gridCol w:w="2640"/>
+      </w:tblGrid>
+      <w:tr>
+        <w:trPr>
+          <w:tblHeader w:val="on"/>
+        </w:trPr>
+        <w:tc>
+          <w:tcPr/>
+          <w:p>
+            <w:pPr>
+              <w:pStyle w:val="Compact"/>
+            </w:pPr>
+            <w:r>
+              <w:t xml:space="preserve">Stage</w:t>
+            </w:r>
+          </w:p>
+        </w:tc>
+        <w:tc>
+          <w:tcPr/>
+          <w:p>
+            <w:pPr>
+              <w:pStyle w:val="Compact"/>
+            </w:pPr>
+            <w:r>
+              <w:t xml:space="preserve">Tools</w:t>
+            </w:r>
+          </w:p>
+        </w:tc>
+        <w:tc>
+          <w:tcPr/>
+          <w:p>
+            <w:pPr>
+              <w:pStyle w:val="Compact"/>
+            </w:pPr>
+            <w:r>
+              <w:t xml:space="preserve">Tasks</w:t>
+            </w:r>
+          </w:p>
+        </w:tc>
+      </w:tr>
+      <w:tr>
+        <w:tc>
+          <w:tcPr/>
+          <w:p>
+            <w:pPr>
+              <w:pStyle w:val="Compact"/>
+            </w:pPr>
+            <w:r>
+              <w:t xml:space="preserve">Market</w:t>
+            </w:r>
+          </w:p>
+        </w:tc>
+        <w:tc>
+          <w:tcPr/>
+          <w:p>
+            <w:pPr>
+              <w:pStyle w:val="Compact"/>
+            </w:pPr>
+            <w:r>
+              <w:rPr>
+                <w:rStyle w:val="VerbatimChar"/>
+              </w:rPr>
+              <w:t xml:space="preserve">get_stock_data</w:t>
+            </w:r>
+            <w:r>
+              <w:t xml:space="preserve">,</w:t>
+            </w:r>
+            <w:r>
+              <w:t xml:space="preserve"> </w:t>
+            </w:r>
+            <w:r>
+              <w:rPr>
+                <w:rStyle w:val="VerbatimChar"/>
+              </w:rPr>
+              <w:t xml:space="preserve">get_indicators</w:t>
+            </w:r>
+          </w:p>
+        </w:tc>
+        <w:tc>
+          <w:tcPr/>
+          <w:p>
+            <w:pPr>
+              <w:pStyle w:val="Compact"/>
+            </w:pPr>
+            <w:r>
+              <w:t xml:space="preserve">OHLCV + up to 8 Tier-1 indicators (SMA, EMA, MACD, RSI, Bollinger, ATR, VWMA, MFI)</w:t>
+            </w:r>
+          </w:p>
+        </w:tc>
+      </w:tr>
+      <w:tr>
+        <w:tc>
+          <w:tcPr/>
+          <w:p>
+            <w:pPr>
+              <w:pStyle w:val="Compact"/>
+            </w:pPr>
+            <w:r>
+              <w:t xml:space="preserve">Fundamentals</w:t>
+            </w:r>
+          </w:p>
+        </w:tc>
+        <w:tc>
+          <w:tcPr/>
+          <w:p>
+            <w:pPr>
+              <w:pStyle w:val="Compact"/>
+            </w:pPr>
+            <w:r>
+              <w:rPr>
+                <w:rStyle w:val="VerbatimChar"/>
+              </w:rPr>
+              <w:t xml:space="preserve">get_fundamentals</w:t>
+            </w:r>
+            <w:r>
+              <w:t xml:space="preserve">, statements</w:t>
+            </w:r>
+          </w:p>
+        </w:tc>
+        <w:tc>
+          <w:tcPr/>
+          <w:p>
+            <w:pPr>
+              <w:pStyle w:val="Compact"/>
+            </w:pPr>
+            <w:r>
+              <w:t xml:space="preserve">Revenue, margins, balance-sheet trends</w:t>
+            </w:r>
+          </w:p>
+        </w:tc>
+      </w:tr>
+      <w:tr>
+        <w:tc>
+          <w:tcPr/>
+          <w:p>
+            <w:pPr>
+              <w:pStyle w:val="Compact"/>
+            </w:pPr>
+            <w:r>
+              <w:t xml:space="preserve">News / Sentiment</w:t>
+            </w:r>
+          </w:p>
+        </w:tc>
+        <w:tc>
+          <w:tcPr/>
+          <w:p>
+            <w:pPr>
+              <w:pStyle w:val="Compact"/>
+            </w:pPr>
+            <w:r>
+              <w:rPr>
+                <w:rStyle w:val="VerbatimChar"/>
+              </w:rPr>
+              <w:t xml:space="preserve">get_news</w:t>
+            </w:r>
+            <w:r>
+              <w:t xml:space="preserve">,</w:t>
+            </w:r>
+            <w:r>
+              <w:t xml:space="preserve"> </w:t>
+            </w:r>
+            <w:r>
+              <w:rPr>
+                <w:rStyle w:val="VerbatimChar"/>
+              </w:rPr>
+              <w:t xml:space="preserve">get_global_news</w:t>
+            </w:r>
+          </w:p>
+        </w:tc>
+        <w:tc>
+          <w:tcPr/>
+          <w:p>
+            <w:pPr>
+              <w:pStyle w:val="Compact"/>
+            </w:pPr>
+            <w:r>
+              <w:t xml:space="preserve">Company and macro news synthesis</w:t>
+            </w:r>
+          </w:p>
+        </w:tc>
+      </w:tr>
+      <w:tr>
+        <w:tc>
+          <w:tcPr/>
+          <w:p>
+            <w:pPr>
+              <w:pStyle w:val="Compact"/>
+            </w:pPr>
+            <w:r>
+              <w:t xml:space="preserve">Debate</w:t>
+            </w:r>
+            <w:r>
+              <w:t xml:space="preserve"> </w:t>
+            </w:r>
+            <m:oMath>
+              <m:r>
+                <m:rPr>
+                  <m:sty m:val="p"/>
+                </m:rPr>
+                <m:t>→</m:t>
+              </m:r>
+            </m:oMath>
+            <w:r>
+              <w:t xml:space="preserve"> </w:t>
+            </w:r>
+            <w:r>
+              <w:t xml:space="preserve">Risk</w:t>
+            </w:r>
+          </w:p>
+        </w:tc>
+        <w:tc>
+          <w:tcPr/>
+          <w:p>
+            <w:pPr>
+              <w:pStyle w:val="Compact"/>
+            </w:pPr>
+            <w:r>
+              <w:t xml:space="preserve">—</w:t>
+            </w:r>
+          </w:p>
+        </w:tc>
+        <w:tc>
+          <w:tcPr/>
+          <w:p>
+            <w:pPr>
+              <w:pStyle w:val="Compact"/>
+            </w:pPr>
+            <w:r>
+              <w:t xml:space="preserve">Structured stances</w:t>
+            </w:r>
+            <w:r>
+              <w:t xml:space="preserve"> </w:t>
+            </w:r>
+            <m:oMath>
+              <m:r>
+                <m:rPr>
+                  <m:sty m:val="p"/>
+                </m:rPr>
+                <m:t>→</m:t>
+              </m:r>
+            </m:oMath>
+            <w:r>
+              <w:t xml:space="preserve"> </w:t>
+            </w:r>
+            <w:r>
+              <w:rPr>
+                <w:b/>
+                <w:bCs/>
+              </w:rPr>
+              <w:t xml:space="preserve">BUY/HOLD/SELL</w:t>
+            </w:r>
+          </w:p>
+        </w:tc>
+      </w:tr>
+    </w:tbl>
+    <w:bookmarkEnd w:id="11"/>
+    <w:bookmarkStart w:id="12" w:name="ticker-anonymization"/>
+    <w:p>
+      <w:pPr>
+        <w:pStyle w:val="Heading3"/>
+      </w:pPr>
+      <w:r>
+        <w:rPr>
+          <w:rStyle w:val="SectionNumber"/>
+        </w:rPr>
+        <w:t xml:space="preserve">3.2</w:t>
+      </w:r>
+      <w:r>
+        <w:tab/>
+      </w:r>
+      <w:r>
         <w:t xml:space="preserve">Ticker anonymization</w:t>
       </w:r>
     </w:p>
@@ -597,23 +1139,211 @@
         <w:pStyle w:val="FirstParagraph"/>
       </w:pPr>
       <w:r>
-        <w:t xml:space="preserve">Large language models trained on public text often encode firm-specific narratives—brand reputation, sector themes, and historical events—tied to ticker symbols and company names. In a point-in-time backtest, that</w:t>
-      </w:r>
-      <w:r>
-        <w:t xml:space="preserve"> </w:t>
-      </w:r>
-      <w:r>
-        <w:rPr>
-          <w:b/>
-          <w:bCs/>
-        </w:rPr>
-        <w:t xml:space="preserve">pretraining leakage</w:t>
-      </w:r>
-      <w:r>
-        <w:t xml:space="preserve"> </w:t>
-      </w:r>
-      <w:r>
-        <w:t xml:space="preserve">can bias decisions: the same vendor data may elicit different agent behavior on</w:t>
+        <w:t xml:space="preserve">Deterministic</w:t>
+      </w:r>
+      <w:r>
+        <w:t xml:space="preserve"> </w:t>
+      </w:r>
+      <w:r>
+        <w:t xml:space="preserve"> </w:t>
+      </w:r>
+      <w:r>
+        <w:t xml:space="preserve">aliases for LLM I/O; vendor round-trip de-anonymization; news proper-noun scrubbing. Frozen E1:</w:t>
+      </w:r>
+      <w:r>
+        <w:t xml:space="preserve"> </w:t>
+      </w:r>
+      <w:r>
+        <w:t xml:space="preserve">.</w:t>
+      </w:r>
+    </w:p>
+    <w:bookmarkEnd w:id="12"/>
+    <w:bookmarkStart w:id="13" w:name="backtest-metrics"/>
+    <w:p>
+      <w:pPr>
+        <w:pStyle w:val="Heading3"/>
+      </w:pPr>
+      <w:r>
+        <w:rPr>
+          <w:rStyle w:val="SectionNumber"/>
+        </w:rPr>
+        <w:t xml:space="preserve">3.3</w:t>
+      </w:r>
+      <w:r>
+        <w:tab/>
+      </w:r>
+      <w:r>
+        <w:t xml:space="preserve">Backtest metrics</w:t>
+      </w:r>
+    </w:p>
+    <w:p>
+      <w:pPr>
+        <w:pStyle w:val="FirstParagraph"/>
+      </w:pPr>
+      <w:r>
+        <w:t xml:space="preserve">We emphasize</w:t>
+      </w:r>
+      <w:r>
+        <w:t xml:space="preserve"> </w:t>
+      </w:r>
+      <w:r>
+        <w:rPr>
+          <w:b/>
+          <w:bCs/>
+        </w:rPr>
+        <w:t xml:space="preserve">net return</w:t>
+      </w:r>
+      <w:r>
+        <w:t xml:space="preserve">,</w:t>
+      </w:r>
+      <w:r>
+        <w:t xml:space="preserve"> </w:t>
+      </w:r>
+      <w:r>
+        <w:rPr>
+          <w:b/>
+          <w:bCs/>
+        </w:rPr>
+        <w:t xml:space="preserve">MDD</w:t>
+      </w:r>
+      <w:r>
+        <w:t xml:space="preserve">,</w:t>
+      </w:r>
+      <w:r>
+        <w:t xml:space="preserve"> </w:t>
+      </w:r>
+      <w:r>
+        <w:rPr>
+          <w:b/>
+          <w:bCs/>
+        </w:rPr>
+        <w:t xml:space="preserve">fee drag</w:t>
+      </w:r>
+      <w:r>
+        <w:t xml:space="preserve">, and</w:t>
+      </w:r>
+      <w:r>
+        <w:t xml:space="preserve"> </w:t>
+      </w:r>
+      <w:r>
+        <w:rPr>
+          <w:b/>
+          <w:bCs/>
+        </w:rPr>
+        <w:t xml:space="preserve">alpha vs buy-and-hold</w:t>
+      </w:r>
+      <w:r>
+        <w:t xml:space="preserve">.</w:t>
+      </w:r>
+      <w:r>
+        <w:t xml:space="preserve"> </w:t>
+      </w:r>
+      <w:r>
+        <w:rPr>
+          <w:b/>
+          <w:bCs/>
+        </w:rPr>
+        <w:t xml:space="preserve">Excess Sharpe</w:t>
+      </w:r>
+      <w:r>
+        <w:t xml:space="preserve"> </w:t>
+      </w:r>
+      <w:r>
+        <w:t xml:space="preserve">uses daily equity from frozen CSVs with a</w:t>
+      </w:r>
+      <w:r>
+        <w:t xml:space="preserve"> </w:t>
+      </w:r>
+      <w:r>
+        <w:rPr>
+          <w:b/>
+          <w:bCs/>
+        </w:rPr>
+        <w:t xml:space="preserve">6.5% p.a.</w:t>
+      </w:r>
+      <w:r>
+        <w:t xml:space="preserve"> </w:t>
+      </w:r>
+      <w:r>
+        <w:t xml:space="preserve">risk-free rate (India short-rate proxy)</w:t>
+      </w:r>
+      <w:r>
+        <w:t xml:space="preserve">. Sortino and Calmar are secondary on short windows (67–111 days).</w:t>
+      </w:r>
+    </w:p>
+    <w:bookmarkEnd w:id="13"/>
+    <w:bookmarkEnd w:id="14"/>
+    <w:bookmarkStart w:id="19" w:name="case-study-evaluation"/>
+    <w:p>
+      <w:pPr>
+        <w:pStyle w:val="Heading2"/>
+      </w:pPr>
+      <w:r>
+        <w:rPr>
+          <w:rStyle w:val="SectionNumber"/>
+        </w:rPr>
+        <w:t xml:space="preserve">4</w:t>
+      </w:r>
+      <w:r>
+        <w:tab/>
+      </w:r>
+      <w:r>
+        <w:t xml:space="preserve">Case Study Evaluation</w:t>
+      </w:r>
+    </w:p>
+    <w:bookmarkStart w:id="15" w:name="scope-and-limits-section-4.1"/>
+    <w:p>
+      <w:pPr>
+        <w:pStyle w:val="Heading3"/>
+      </w:pPr>
+      <w:r>
+        <w:rPr>
+          <w:rStyle w:val="SectionNumber"/>
+        </w:rPr>
+        <w:t xml:space="preserve">4.1</w:t>
+      </w:r>
+      <w:r>
+        <w:tab/>
+      </w:r>
+      <w:r>
+        <w:t xml:space="preserve">Scope and limits (Section 4.1)</w:t>
+      </w:r>
+    </w:p>
+    <w:p>
+      <w:pPr>
+        <w:pStyle w:val="FirstParagraph"/>
+      </w:pPr>
+      <w:r>
+        <w:t xml:space="preserve">Two liquid NSE large-caps;</w:t>
+      </w:r>
+      <w:r>
+        <w:t xml:space="preserve"> </w:t>
+      </w:r>
+      <w:r>
+        <w:rPr>
+          <w:b/>
+          <w:bCs/>
+        </w:rPr>
+        <w:t xml:space="preserve">four regime windows</w:t>
+      </w:r>
+      <w:r>
+        <w:t xml:space="preserve">;</w:t>
+      </w:r>
+      <w:r>
+        <w:t xml:space="preserve"> </w:t>
+      </w:r>
+      <w:r>
+        <w:rPr>
+          <w:b/>
+          <w:bCs/>
+        </w:rPr>
+        <w:t xml:space="preserve">N=1 trajectory per window</w:t>
+      </w:r>
+      <w:r>
+        <w:t xml:space="preserve">; exogenous bear/bull labels ($</w:t>
+      </w:r>
+      <w:r>
+        <w:t xml:space="preserve">$10% underlying B&amp;H); pre-specified calendars in</w:t>
       </w:r>
       <w:r>
         <w:t xml:space="preserve"> </w:t>
@@ -621,120 +1351,17 @@
       <w:r>
         <w:rPr>
           <w:rStyle w:val="VerbatimChar"/>
-        </w:rPr>
-        <w:t xml:space="preserve">RELIANCE.NS</w:t>
-      </w:r>
-      <w:r>
-        <w:t xml:space="preserve"> </w:t>
-      </w:r>
-      <w:r>
-        <w:t xml:space="preserve">versus an unseen alias. Hindsight 20/20 optionally</w:t>
-      </w:r>
-      <w:r>
-        <w:t xml:space="preserve"> </w:t>
-      </w:r>
-      <w:r>
-        <w:rPr>
-          <w:b/>
-          <w:bCs/>
-        </w:rPr>
-        <w:t xml:space="preserve">anonymizes the issuer</w:t>
-      </w:r>
-      <w:r>
-        <w:t xml:space="preserve"> </w:t>
-      </w:r>
-      <w:r>
-        <w:t xml:space="preserve">for all LLM-facing prompts and tool outputs: each real symbol maps to a deterministic synthetic id (</w:t>
-      </w:r>
-      <w:r>
-        <w:rPr>
-          <w:rStyle w:val="VerbatimChar"/>
-        </w:rPr>
-        <w:t xml:space="preserve">STOCK_####</w:t>
-      </w:r>
-      <w:r>
-        <w:t xml:space="preserve">, hash-derived); tool wrappers</w:t>
-      </w:r>
-      <w:r>
-        <w:t xml:space="preserve"> </w:t>
-      </w:r>
-      <w:r>
-        <w:rPr>
-          <w:b/>
-          <w:bCs/>
-        </w:rPr>
-        <w:t xml:space="preserve">de-anonymize</w:t>
-      </w:r>
-      <w:r>
-        <w:t xml:space="preserve"> </w:t>
-      </w:r>
-      <w:r>
-        <w:t xml:space="preserve">before market-data API calls, then</w:t>
-      </w:r>
-      <w:r>
-        <w:t xml:space="preserve"> </w:t>
-      </w:r>
-      <w:r>
-        <w:rPr>
-          <w:b/>
-          <w:bCs/>
-        </w:rPr>
-        <w:t xml:space="preserve">re-scrub</w:t>
-      </w:r>
-      <w:r>
-        <w:t xml:space="preserve"> </w:t>
-      </w:r>
-      <w:r>
-        <w:t xml:space="preserve">responses; news headlines additionally pass through a lightweight proper-noun scrubber. Frozen E1 runs use</w:t>
-      </w:r>
-      <w:r>
-        <w:t xml:space="preserve"> </w:t>
-      </w:r>
-      <w:r>
-        <w:rPr>
-          <w:rStyle w:val="VerbatimChar"/>
-          <w:b/>
-          <w:bCs/>
-        </w:rPr>
-        <w:t xml:space="preserve">enable_anonymization=True</w:t>
-      </w:r>
-      <w:r>
-        <w:t xml:space="preserve"> </w:t>
-      </w:r>
-      <w:r>
-        <w:t xml:space="preserve">(default in</w:t>
-      </w:r>
-      <w:r>
-        <w:t xml:space="preserve"> </w:t>
-      </w:r>
-      <w:r>
-        <w:rPr>
-          <w:rStyle w:val="VerbatimChar"/>
-        </w:rPr>
-        <w:t xml:space="preserve">backtest_mvp.py</w:t>
-      </w:r>
-      <w:r>
-        <w:t xml:space="preserve">). We do not ablate anonymization in Section 4—reporting with it</w:t>
-      </w:r>
-      <w:r>
-        <w:t xml:space="preserve"> </w:t>
-      </w:r>
-      <w:r>
-        <w:rPr>
-          <w:b/>
-          <w:bCs/>
-        </w:rPr>
-        <w:t xml:space="preserve">on</w:t>
-      </w:r>
-      <w:r>
-        <w:t xml:space="preserve"> </w:t>
-      </w:r>
-      <w:r>
-        <w:t xml:space="preserve">is a conservative choice that reduces name-based bias when comparing regimes and tickers.</w:t>
-      </w:r>
-    </w:p>
-    <w:bookmarkEnd w:id="11"/>
-    <w:bookmarkStart w:id="12" w:name="backtest-metrics"/>
+          <w:b/>
+          <w:bCs/>
+        </w:rPr>
+        <w:t xml:space="preserve">regime-timeranges</w:t>
+      </w:r>
+      <w:r>
+        <w:t xml:space="preserve">. Not a hypothesis test about expected alpha.</w:t>
+      </w:r>
+    </w:p>
+    <w:bookmarkEnd w:id="15"/>
+    <w:bookmarkStart w:id="16" w:name="positioning-table-2"/>
     <w:p>
       <w:pPr>
         <w:pStyle w:val="Heading3"/>
@@ -743,13 +1370,32 @@
         <w:rPr>
           <w:rStyle w:val="SectionNumber"/>
         </w:rPr>
-        <w:t xml:space="preserve">3.2</w:t>
+        <w:t xml:space="preserve">4.2</w:t>
       </w:r>
       <w:r>
         <w:tab/>
       </w:r>
       <w:r>
-        <w:t xml:space="preserve">Backtest metrics</w:t>
+        <w:t xml:space="preserve">Positioning (Table 2)</w:t>
+      </w:r>
+    </w:p>
+    <w:bookmarkEnd w:id="16"/>
+    <w:bookmarkStart w:id="17" w:name="results"/>
+    <w:p>
+      <w:pPr>
+        <w:pStyle w:val="Heading3"/>
+      </w:pPr>
+      <w:r>
+        <w:rPr>
+          <w:rStyle w:val="SectionNumber"/>
+        </w:rPr>
+        <w:t xml:space="preserve">4.3</w:t>
+      </w:r>
+      <w:r>
+        <w:tab/>
+      </w:r>
+      <w:r>
+        <w:t xml:space="preserve">Results</w:t>
       </w:r>
     </w:p>
     <w:p>
@@ -757,111 +1403,100 @@
         <w:pStyle w:val="FirstParagraph"/>
       </w:pPr>
       <w:r>
-        <w:t xml:space="preserve">The paper ledger records daily agent equity after fees. We report</w:t>
-      </w:r>
-      <w:r>
-        <w:t xml:space="preserve"> </w:t>
-      </w:r>
-      <w:r>
-        <w:rPr>
-          <w:b/>
-          <w:bCs/>
-        </w:rPr>
-        <w:t xml:space="preserve">total return</w:t>
-      </w:r>
-      <w:r>
-        <w:t xml:space="preserve"> </w:t>
-      </w:r>
-      <w:r>
-        <w:t xml:space="preserve">on agent equity;</w:t>
-      </w:r>
-      <w:r>
-        <w:t xml:space="preserve"> </w:t>
-      </w:r>
-      <w:r>
-        <w:rPr>
-          <w:b/>
-          <w:bCs/>
-        </w:rPr>
-        <w:t xml:space="preserve">maximum drawdown (MDD)</w:t>
-      </w:r>
-      <w:r>
-        <w:t xml:space="preserve"> </w:t>
-      </w:r>
-      <w:r>
-        <w:t xml:space="preserve">as peak-to-trough decline on the agent equity curve, with</w:t>
-      </w:r>
-      <w:r>
-        <w:t xml:space="preserve"> </w:t>
-      </w:r>
-      <w:r>
-        <w:rPr>
-          <w:b/>
-          <w:bCs/>
-        </w:rPr>
-        <w:t xml:space="preserve">buy-and-hold MDD</w:t>
-      </w:r>
-      <w:r>
-        <w:t xml:space="preserve"> </w:t>
-      </w:r>
-      <w:r>
-        <w:t xml:space="preserve">on the same underlying adjusted closes for comparison; and</w:t>
-      </w:r>
-      <w:r>
-        <w:t xml:space="preserve"> </w:t>
-      </w:r>
-      <w:r>
-        <w:rPr>
-          <w:b/>
-          <w:bCs/>
-        </w:rPr>
-        <w:t xml:space="preserve">Sharpe ratio</w:t>
-      </w:r>
-      <w:r>
-        <w:t xml:space="preserve"> </w:t>
-      </w:r>
-      <w:r>
-        <w:t xml:space="preserve">as mean daily simple return divided by its standard deviation, scaled by</w:t>
-      </w:r>
-      <w:r>
-        <w:t xml:space="preserve"> </w:t>
+        <w:rPr>
+          <w:b/>
+          <w:bCs/>
+        </w:rPr>
+        <w:t xml:space="preserve">Table 1.</w:t>
+      </w:r>
+      <w:r>
+        <w:t xml:space="preserve"> </w:t>
+      </w:r>
+      <w:r>
+        <w:t xml:space="preserve">Primary metrics from frozen CSVs ($100,000 start).</w:t>
+      </w:r>
+    </w:p>
+    <w:p>
+      <w:pPr>
+        <w:pStyle w:val="BodyText"/>
+      </w:pPr>
+      <w:r>
+        <w:rPr>
+          <w:b/>
+          <w:bCs/>
+        </w:rPr>
+        <w:t xml:space="preserve">Table 3.</w:t>
+      </w:r>
+      <w:r>
+        <w:t xml:space="preserve"> </w:t>
+      </w:r>
+      <w:r>
+        <w:t xml:space="preserve">Excess Sharpe (6.5% p.a. </w:t>
       </w:r>
       <m:oMath>
-        <m:rad>
-          <m:radPr>
-            <m:degHide m:val="on"/>
-          </m:radPr>
-          <m:deg/>
+        <m:sSub>
           <m:e>
             <m:r>
-              <m:t>252</m:t>
+              <m:t>R</m:t>
             </m:r>
           </m:e>
-        </m:rad>
+          <m:sub>
+            <m:r>
+              <m:t>f</m:t>
+            </m:r>
+          </m:sub>
+        </m:sSub>
       </m:oMath>
       <w:r>
-        <w:t xml:space="preserve">.</w:t>
-      </w:r>
-      <w:r>
-        <w:t xml:space="preserve"> </w:t>
-      </w:r>
-      <w:r>
-        <w:rPr>
-          <w:b/>
-          <w:bCs/>
-        </w:rPr>
-        <w:t xml:space="preserve">No risk-free rate is subtracted</w:t>
-      </w:r>
-      <w:r>
-        <w:t xml:space="preserve"> </w:t>
-      </w:r>
-      <w:r>
-        <w:t xml:space="preserve">in Frozen E1 (excess Sharpe is future work). Short windows (67–111 trading days) yield noisy Sharpe estimates for discrete-signal agents.</w:t>
-      </w:r>
-    </w:p>
-    <w:bookmarkEnd w:id="12"/>
-    <w:bookmarkEnd w:id="13"/>
-    <w:bookmarkStart w:id="17" w:name="experiments"/>
+        <w:t xml:space="preserve">), Sortino, Calmar (post-hoc on frozen equity).</w:t>
+      </w:r>
+    </w:p>
+    <w:p>
+      <w:pPr>
+        <w:pStyle w:val="BodyText"/>
+      </w:pPr>
+      <w:r>
+        <w:rPr>
+          <w:b/>
+          <w:bCs/>
+        </w:rPr>
+        <w:t xml:space="preserve">Patterns.</w:t>
+      </w:r>
+      <w:r>
+        <w:t xml:space="preserve"> </w:t>
+      </w:r>
+      <w:r>
+        <w:t xml:space="preserve">Bear (2/2): smaller loss and lower MDD than B&amp;H; SELL-heavy signals. Bull: TCS nearly tracks B&amp;H; RELIANCE lags despite positive return (+5.6%)—fee drag ($</w:t>
+      </w:r>
+      <w:r>
+        <w:t xml:space="preserve">$0.6pp) does not explain the $</w:t>
+      </w:r>
+      <w:r>
+        <w:t xml:space="preserve">$9.5pp alpha gap; defensive final policy (74 SELL days) is the plausible binding constraint. Internal bull stances can remain buy-leaning while final signals stay defensive.</w:t>
+      </w:r>
+    </w:p>
+    <w:bookmarkEnd w:id="17"/>
+    <w:bookmarkStart w:id="18" w:name="figures"/>
+    <w:p>
+      <w:pPr>
+        <w:pStyle w:val="Heading3"/>
+      </w:pPr>
+      <w:r>
+        <w:rPr>
+          <w:rStyle w:val="SectionNumber"/>
+        </w:rPr>
+        <w:t xml:space="preserve">4.4</w:t>
+      </w:r>
+      <w:r>
+        <w:tab/>
+      </w:r>
+      <w:r>
+        <w:t xml:space="preserve">Figures</w:t>
+      </w:r>
+    </w:p>
+    <w:bookmarkEnd w:id="18"/>
+    <w:bookmarkEnd w:id="19"/>
+    <w:bookmarkStart w:id="20" w:name="conclusion"/>
     <w:p>
       <w:pPr>
         <w:pStyle w:val="Heading2"/>
@@ -870,31 +1505,13 @@
         <w:rPr>
           <w:rStyle w:val="SectionNumber"/>
         </w:rPr>
-        <w:t xml:space="preserve">4</w:t>
+        <w:t xml:space="preserve">5</w:t>
       </w:r>
       <w:r>
         <w:tab/>
       </w:r>
       <w:r>
-        <w:t xml:space="preserve">Experiments</w:t>
-      </w:r>
-    </w:p>
-    <w:bookmarkStart w:id="14" w:name="regime-definition"/>
-    <w:p>
-      <w:pPr>
-        <w:pStyle w:val="Heading3"/>
-      </w:pPr>
-      <w:r>
-        <w:rPr>
-          <w:rStyle w:val="SectionNumber"/>
-        </w:rPr>
-        <w:t xml:space="preserve">4.1</w:t>
-      </w:r>
-      <w:r>
-        <w:tab/>
-      </w:r>
-      <w:r>
-        <w:t xml:space="preserve">Regime definition</w:t>
+        <w:t xml:space="preserve">Conclusion</w:t>
       </w:r>
     </w:p>
     <w:p>
@@ -902,170 +1519,36 @@
         <w:pStyle w:val="FirstParagraph"/>
       </w:pPr>
       <w:r>
-        <w:t xml:space="preserve">For each ticker, calendar windows in</w:t>
-      </w:r>
-      <w:r>
-        <w:t xml:space="preserve"> </w:t>
-      </w:r>
-      <w:r>
-        <w:rPr>
-          <w:rStyle w:val="VerbatimChar"/>
-          <w:b/>
-          <w:bCs/>
-        </w:rPr>
-        <w:t xml:space="preserve">regime-timeranges</w:t>
-      </w:r>
-      <w:r>
-        <w:t xml:space="preserve"> </w:t>
-      </w:r>
-      <w:r>
-        <w:t xml:space="preserve">are labeled</w:t>
-      </w:r>
-      <w:r>
-        <w:t xml:space="preserve"> </w:t>
-      </w:r>
-      <w:r>
-        <w:rPr>
-          <w:b/>
-          <w:bCs/>
-        </w:rPr>
-        <w:t xml:space="preserve">bear</w:t>
-      </w:r>
-      <w:r>
-        <w:t xml:space="preserve"> </w:t>
-      </w:r>
-      <w:r>
-        <w:t xml:space="preserve">if underlying buy-and-hold return is at most</w:t>
-      </w:r>
-      <w:r>
-        <w:t xml:space="preserve"> </w:t>
-      </w:r>
-      <w:r>
-        <w:rPr>
-          <w:b/>
-          <w:bCs/>
-        </w:rPr>
-        <w:t xml:space="preserve">-10%</w:t>
-      </w:r>
-      <w:r>
-        <w:t xml:space="preserve">,</w:t>
-      </w:r>
-      <w:r>
-        <w:t xml:space="preserve"> </w:t>
-      </w:r>
-      <w:r>
-        <w:rPr>
-          <w:b/>
-          <w:bCs/>
-        </w:rPr>
-        <w:t xml:space="preserve">bull</w:t>
-      </w:r>
-      <w:r>
-        <w:t xml:space="preserve"> </w:t>
-      </w:r>
-      <w:r>
-        <w:t xml:space="preserve">if at least</w:t>
-      </w:r>
-      <w:r>
-        <w:t xml:space="preserve"> </w:t>
-      </w:r>
-      <w:r>
-        <w:rPr>
-          <w:b/>
-          <w:bCs/>
-        </w:rPr>
-        <w:t xml:space="preserve">+10%</w:t>
-      </w:r>
-      <w:r>
-        <w:t xml:space="preserve"> </w:t>
-      </w:r>
-      <w:r>
-        <w:t xml:space="preserve">over the processed window. Each run starts from</w:t>
-      </w:r>
-      <w:r>
-        <w:t xml:space="preserve"> </w:t>
-      </w:r>
-      <w:r>
-        <w:rPr>
-          <w:b/>
-          <w:bCs/>
-        </w:rPr>
-        <w:t xml:space="preserve">$100,000</w:t>
-      </w:r>
-      <w:r>
-        <w:t xml:space="preserve"> </w:t>
-      </w:r>
-      <w:r>
-        <w:t xml:space="preserve">fresh cash. Windows differ by ticker.</w:t>
-      </w:r>
-    </w:p>
-    <w:bookmarkEnd w:id="14"/>
-    <w:bookmarkStart w:id="15" w:name="protocol-and-results"/>
-    <w:p>
-      <w:pPr>
-        <w:pStyle w:val="Heading3"/>
-      </w:pPr>
-      <w:r>
-        <w:rPr>
-          <w:rStyle w:val="SectionNumber"/>
-        </w:rPr>
-        <w:t xml:space="preserve">4.2</w:t>
-      </w:r>
-      <w:r>
-        <w:tab/>
-      </w:r>
-      <w:r>
-        <w:t xml:space="preserve">Protocol and results</w:t>
-      </w:r>
-    </w:p>
-    <w:p>
-      <w:pPr>
-        <w:pStyle w:val="FirstParagraph"/>
-      </w:pPr>
-      <w:r>
-        <w:rPr>
-          <w:b/>
-          <w:bCs/>
-        </w:rPr>
-        <w:t xml:space="preserve">Table 1.</w:t>
-      </w:r>
-      <w:r>
-        <w:t xml:space="preserve"> </w:t>
-      </w:r>
-      <w:r>
-        <w:t xml:space="preserve">Four frozen runs. Sharpe is computed on</w:t>
-      </w:r>
-      <w:r>
-        <w:t xml:space="preserve"> </w:t>
-      </w:r>
-      <w:r>
-        <w:rPr>
-          <w:b/>
-          <w:bCs/>
-        </w:rPr>
-        <w:t xml:space="preserve">agent</w:t>
-      </w:r>
-      <w:r>
-        <w:t xml:space="preserve"> </w:t>
-      </w:r>
-      <w:r>
-        <w:t xml:space="preserve">daily equity returns (annualized; see footnote in Section 3.4;</w:t>
-      </w:r>
-      <w:r>
-        <w:t xml:space="preserve"> </w:t>
-      </w:r>
-      <w:r>
-        <w:rPr>
-          <w:b/>
-          <w:bCs/>
-        </w:rPr>
-        <w:t xml:space="preserve">no risk-free rate</w:t>
-      </w:r>
-      <w:r>
-        <w:t xml:space="preserve"> </w:t>
-      </w:r>
-      <w:r>
-        <w:t xml:space="preserve">subtracted).</w:t>
+        <w:t xml:space="preserve">We presented a reproducible point-in-time LangGraph stack and a</w:t>
+      </w:r>
+      <w:r>
+        <w:t xml:space="preserve"> </w:t>
+      </w:r>
+      <w:r>
+        <w:rPr>
+          <w:b/>
+          <w:bCs/>
+        </w:rPr>
+        <w:t xml:space="preserve">scoped four-window case study</w:t>
+      </w:r>
+      <w:r>
+        <w:t xml:space="preserve">. Bear windows show lower loss and drawdown than B&amp;H; bull outcomes are heterogeneous—an</w:t>
+      </w:r>
+      <w:r>
+        <w:t xml:space="preserve"> </w:t>
+      </w:r>
+      <w:r>
+        <w:rPr>
+          <w:b/>
+          <w:bCs/>
+        </w:rPr>
+        <w:t xml:space="preserve">architectural boundary</w:t>
+      </w:r>
+      <w:r>
+        <w:t xml:space="preserve"> </w:t>
+      </w:r>
+      <w:r>
+        <w:t xml:space="preserve">of defensive coordination, not a universal alpha claim.</w:t>
       </w:r>
     </w:p>
     <w:p>
@@ -1077,173 +1560,33 @@
           <w:b/>
           <w:bCs/>
         </w:rPr>
-        <w:t xml:space="preserve">Bear (2/2):</w:t>
-      </w:r>
-      <w:r>
-        <w:t xml:space="preserve"> </w:t>
-      </w:r>
-      <w:r>
-        <w:t xml:space="preserve">agent loses less than buy-and-hold on</w:t>
-      </w:r>
-      <w:r>
-        <w:t xml:space="preserve"> </w:t>
-      </w:r>
-      <w:r>
-        <w:rPr>
-          <w:b/>
-          <w:bCs/>
-        </w:rPr>
-        <w:t xml:space="preserve">total return</w:t>
-      </w:r>
-      <w:r>
-        <w:t xml:space="preserve"> </w:t>
-      </w:r>
-      <w:r>
-        <w:t xml:space="preserve">and shows</w:t>
-      </w:r>
-      <w:r>
-        <w:t xml:space="preserve"> </w:t>
-      </w:r>
-      <w:r>
-        <w:rPr>
-          <w:b/>
-          <w:bCs/>
-        </w:rPr>
-        <w:t xml:space="preserve">lower path drawdown</w:t>
-      </w:r>
-      <w:r>
-        <w:t xml:space="preserve"> </w:t>
-      </w:r>
-      <w:r>
-        <w:t xml:space="preserve">(e.g., RELIANCE bear: agent MDD 5.1% vs B&amp;H MDD 21.0%), consistent with SELL-heavy signals and reduced long exposure.</w:t>
-      </w:r>
-      <w:r>
-        <w:t xml:space="preserve"> </w:t>
-      </w:r>
-      <w:r>
-        <w:rPr>
-          <w:b/>
-          <w:bCs/>
-        </w:rPr>
-        <w:t xml:space="preserve">Bull:</w:t>
-      </w:r>
-      <w:r>
-        <w:t xml:space="preserve"> </w:t>
-      </w:r>
-      <w:r>
-        <w:t xml:space="preserve">RELIANCE lags B&amp;H; TCS nearly tracks B&amp;H.</w:t>
-      </w:r>
-      <w:r>
-        <w:t xml:space="preserve"> </w:t>
-      </w:r>
-      <w:r>
-        <w:rPr>
-          <w:b/>
-          <w:bCs/>
-        </w:rPr>
-        <w:t xml:space="preserve">Sharpe</w:t>
-      </w:r>
-      <w:r>
-        <w:t xml:space="preserve"> </w:t>
-      </w:r>
-      <w:r>
-        <w:t xml:space="preserve">is negative in three of four runs—including RELIANCE bull (+5.6% return)—because daily equity volatility dominates on short windows; only TCS bull is Sharpe-positive (+4.25). Interpret Sharpe alongside total return and MDD, not in isolation.</w:t>
-      </w:r>
-    </w:p>
-    <w:bookmarkEnd w:id="15"/>
-    <w:bookmarkStart w:id="16" w:name="figures"/>
-    <w:p>
-      <w:pPr>
-        <w:pStyle w:val="Heading3"/>
-      </w:pPr>
-      <w:r>
-        <w:rPr>
-          <w:rStyle w:val="SectionNumber"/>
-        </w:rPr>
-        <w:t xml:space="preserve">4.3</w:t>
-      </w:r>
-      <w:r>
-        <w:tab/>
-      </w:r>
-      <w:r>
-        <w:t xml:space="preserve">Figures</w:t>
-      </w:r>
-    </w:p>
-    <w:bookmarkEnd w:id="16"/>
-    <w:bookmarkEnd w:id="17"/>
-    <w:bookmarkStart w:id="18" w:name="conclusion"/>
-    <w:p>
-      <w:pPr>
-        <w:pStyle w:val="Heading2"/>
-      </w:pPr>
-      <w:r>
-        <w:rPr>
-          <w:rStyle w:val="SectionNumber"/>
-        </w:rPr>
-        <w:t xml:space="preserve">5</w:t>
-      </w:r>
-      <w:r>
-        <w:tab/>
-      </w:r>
-      <w:r>
-        <w:t xml:space="preserve">Conclusion</w:t>
-      </w:r>
-    </w:p>
-    <w:p>
-      <w:pPr>
-        <w:pStyle w:val="FirstParagraph"/>
-      </w:pPr>
-      <w:r>
-        <w:t xml:space="preserve">We presented an open LangGraph stack and</w:t>
-      </w:r>
-      <w:r>
-        <w:t xml:space="preserve"> </w:t>
-      </w:r>
-      <w:r>
-        <w:rPr>
-          <w:b/>
-          <w:bCs/>
-        </w:rPr>
-        <w:t xml:space="preserve">multi-ticker regime-conditioned</w:t>
-      </w:r>
-      <w:r>
-        <w:t xml:space="preserve"> </w:t>
-      </w:r>
-      <w:r>
-        <w:t xml:space="preserve">evaluation. Bear windows show relative downside protection on both</w:t>
-      </w:r>
-      <w:r>
-        <w:t xml:space="preserve"> </w:t>
-      </w:r>
-      <w:r>
-        <w:rPr>
-          <w:b/>
-          <w:bCs/>
-        </w:rPr>
-        <w:t xml:space="preserve">return and drawdown</w:t>
-      </w:r>
-      <w:r>
-        <w:t xml:space="preserve">; bull outcomes are heterogeneous.</w:t>
-      </w:r>
-      <w:r>
-        <w:t xml:space="preserve"> </w:t>
-      </w:r>
-      <w:r>
-        <w:rPr>
-          <w:b/>
-          <w:bCs/>
-        </w:rPr>
         <w:t xml:space="preserve">Limitations:</w:t>
       </w:r>
       <w:r>
         <w:t xml:space="preserve"> </w:t>
       </w:r>
       <w:r>
-        <w:t xml:space="preserve">two tickers, per-ticker calendars, one LLM; anonymization enabled but not ablated; Sharpe without a risk-free benchmark and on short windows.</w:t>
-      </w:r>
-    </w:p>
-    <w:bookmarkEnd w:id="18"/>
-    <w:bookmarkStart w:id="19" w:name="contributions"/>
+        <w:t xml:space="preserve">N=1 per window; two tickers; one LLM; anonymization not ablated; no multi-seed or index-universe evaluation; no latency CBS.</w:t>
+      </w:r>
+      <w:r>
+        <w:t xml:space="preserve"> </w:t>
+      </w:r>
+      <w:r>
+        <w:rPr>
+          <w:b/>
+          <w:bCs/>
+        </w:rPr>
+        <w:t xml:space="preserve">Future work:</w:t>
+      </w:r>
+      <w:r>
+        <w:t xml:space="preserve"> </w:t>
+      </w:r>
+      <w:r>
+        <w:t xml:space="preserve">seeds, broader PIT universes, anonymization ablations.</w:t>
+      </w:r>
+    </w:p>
+    <w:bookmarkEnd w:id="20"/>
+    <w:bookmarkStart w:id="21" w:name="contributions"/>
     <w:p>
       <w:pPr>
         <w:pStyle w:val="Heading2"/>
@@ -1270,7 +1613,7 @@
         </w:numPr>
       </w:pPr>
       <w:r>
-        <w:t xml:space="preserve">Multi-agent decision graph.</w:t>
+        <w:t xml:space="preserve">Reproducible backtest harness and frozen CSV artifacts.</w:t>
       </w:r>
     </w:p>
     <w:p>
@@ -1282,7 +1625,7 @@
         </w:numPr>
       </w:pPr>
       <w:r>
-        <w:t xml:space="preserve">Multi-ticker regime-conditioned evaluation (four frozen CSVs).</w:t>
+        <w:t xml:space="preserve">Point-in-time policy and optional anonymization.</w:t>
       </w:r>
     </w:p>
     <w:p>
@@ -1294,7 +1637,7 @@
         </w:numPr>
       </w:pPr>
       <w:r>
-        <w:t xml:space="preserve">Structured stage outputs.</w:t>
+        <w:t xml:space="preserve">Structured Pydantic stage outputs.</w:t>
       </w:r>
     </w:p>
     <w:p>
@@ -1306,7 +1649,7 @@
         </w:numPr>
       </w:pPr>
       <w:r>
-        <w:t xml:space="preserve">Point-in-time policy and anonymization.</w:t>
+        <w:t xml:space="preserve">Multi-agent graph with tool-bound analyst decomposition.</w:t>
       </w:r>
     </w:p>
     <w:p>
@@ -1318,11 +1661,11 @@
         </w:numPr>
       </w:pPr>
       <w:r>
-        <w:t xml:space="preserve">Backtest harness and analysis artifacts.</w:t>
-      </w:r>
-    </w:p>
-    <w:bookmarkEnd w:id="19"/>
-    <w:bookmarkStart w:id="20" w:name="acknowledgements"/>
+        <w:t xml:space="preserve">Honest regime-conditioned case study with documented limits.</w:t>
+      </w:r>
+    </w:p>
+    <w:bookmarkEnd w:id="21"/>
+    <w:bookmarkStart w:id="22" w:name="acknowledgements"/>
     <w:p>
       <w:pPr>
         <w:pStyle w:val="Heading2"/>
@@ -1352,11 +1695,11 @@
         <w:t xml:space="preserve"> </w:t>
       </w:r>
       <w:r>
-        <w:t xml:space="preserve">(Xiao et al., 2024; Tauric Research, Apache License 2.0). We thank the authors for open-sourcing the framework.</w:t>
-      </w:r>
-    </w:p>
-    <w:bookmarkEnd w:id="20"/>
-    <w:bookmarkStart w:id="21" w:name="references"/>
+        <w:t xml:space="preserve">(Xiao et al., 2024; Tauric Research, Apache License 2.0).</w:t>
+      </w:r>
+    </w:p>
+    <w:bookmarkEnd w:id="22"/>
+    <w:bookmarkStart w:id="23" w:name="references"/>
     <w:p>
       <w:pPr>
         <w:pStyle w:val="Heading2"/>
@@ -1370,23 +1713,202 @@
         <w:pStyle w:val="FirstParagraph"/>
       </w:pPr>
       <w:r>
+        <w:t xml:space="preserve">B</w:t>
+      </w:r>
+      <w:r>
+        <w:t xml:space="preserve">dic</w:t>
+      </w:r>
+      <w:r>
+        <w:t xml:space="preserve">, C., B</w:t>
+      </w:r>
+      <w:r>
+        <w:t xml:space="preserve">dic</w:t>
+      </w:r>
+      <w:r>
+        <w:t xml:space="preserve">, A., Ganzha, M., Ivanovi'c, M., Paprzycki, M., Seli</w:t>
+      </w:r>
+      <w:r>
+        <w:t xml:space="preserve">teanu, D. and Wrona, Z., 2025. Contemporary Agent Technology: LLM-Driven Advancements vs Classic Multi-Agent Systems.</w:t>
+      </w:r>
+      <w:r>
+        <w:t xml:space="preserve"> </w:t>
+      </w:r>
+      <w:r>
+        <w:t xml:space="preserve"> </w:t>
+      </w:r>
+      <w:r>
+        <w:t xml:space="preserve">arXiv:2509.02515 [cs.MA].</w:t>
+      </w:r>
+      <w:r>
+        <w:t xml:space="preserve"> </w:t>
+      </w:r>
+    </w:p>
+    <w:p>
+      <w:pPr>
+        <w:pStyle w:val="BodyText"/>
+      </w:pPr>
+      <w:r>
+        <w:t xml:space="preserve">Bailey, D.H., Borwein, J.M., L'opez de Prado, M. and Zhu, Q.J., 2014. Pseudo-Mathematics and Financial Charlatanism: The Effects of Backtest Overfitting on Out-of-Sample Performance.</w:t>
+      </w:r>
+      <w:r>
+        <w:t xml:space="preserve"> </w:t>
+      </w:r>
+      <w:r>
+        <w:t xml:space="preserve">, 61(5), pp.458–471.</w:t>
+      </w:r>
+      <w:r>
+        <w:t xml:space="preserve"> </w:t>
+      </w:r>
+    </w:p>
+    <w:p>
+      <w:pPr>
+        <w:pStyle w:val="BodyText"/>
+      </w:pPr>
+      <w:r>
+        <w:t xml:space="preserve">Dewansh, S., 2026. Policy Convergence and Explainable Stability in Orchestrated Multi-Agent LLM Trading Frameworks.</w:t>
+      </w:r>
+      <w:r>
+        <w:t xml:space="preserve"> </w:t>
+      </w:r>
+      <w:r>
+        <w:t xml:space="preserve">, 12(2), pp.058–064.</w:t>
+      </w:r>
+      <w:r>
+        <w:t xml:space="preserve"> </w:t>
+      </w:r>
+    </w:p>
+    <w:p>
+      <w:pPr>
+        <w:pStyle w:val="BodyText"/>
+      </w:pPr>
+      <w:r>
+        <w:t xml:space="preserve">Jeon, J. and Lee, H., 2026. Can Blindfolded LLMs Still Trade? An Anonymization-First Framework for Portfolio Optimization.</w:t>
+      </w:r>
+      <w:r>
+        <w:t xml:space="preserve"> </w:t>
+      </w:r>
+      <w:r>
+        <w:t xml:space="preserve"> </w:t>
+      </w:r>
+      <w:r>
+        <w:t xml:space="preserve">arXiv:2603.17692 [cs.LG].</w:t>
+      </w:r>
+      <w:r>
+        <w:t xml:space="preserve"> </w:t>
+      </w:r>
+    </w:p>
+    <w:p>
+      <w:pPr>
+        <w:pStyle w:val="BodyText"/>
+      </w:pPr>
+      <w:r>
+        <w:t xml:space="preserve">Li, X., Zeng, Y., Xing, X., Xu, J. and Xu, X., 2025. QuantAgents: Towards Multi-agent Financial System via Simulated Trading. In</w:t>
+      </w:r>
+      <w:r>
+        <w:t xml:space="preserve"> </w:t>
+      </w:r>
+      <w:r>
+        <w:t xml:space="preserve">, pp.17438–17464, Suzhou, China.</w:t>
+      </w:r>
+      <w:r>
+        <w:t xml:space="preserve"> </w:t>
+      </w:r>
+    </w:p>
+    <w:p>
+      <w:pPr>
+        <w:pStyle w:val="BodyText"/>
+      </w:pPr>
+      <w:r>
+        <w:t xml:space="preserve">Miyazaki, K., Kawahara, T., Roberts, S. and Zohren, S., 2026. Toward Expert Investment Teams: A Multi-Agent LLM System with Fine-Grained Trading Tasks.</w:t>
+      </w:r>
+      <w:r>
+        <w:t xml:space="preserve"> </w:t>
+      </w:r>
+      <w:r>
+        <w:t xml:space="preserve"> </w:t>
+      </w:r>
+      <w:r>
+        <w:t xml:space="preserve">arXiv:2602.23330 [cs.AI].</w:t>
+      </w:r>
+      <w:r>
+        <w:t xml:space="preserve"> </w:t>
+      </w:r>
+    </w:p>
+    <w:p>
+      <w:pPr>
+        <w:pStyle w:val="BodyText"/>
+      </w:pPr>
+      <w:r>
+        <w:t xml:space="preserve">Nguyen, P. and Pham, T., 2026. Toward Reliable Evaluation of LLM-Based Financial Multi-Agent Systems: Taxonomy, Coordination Primacy, and Cost Awareness.</w:t>
+      </w:r>
+      <w:r>
+        <w:t xml:space="preserve"> </w:t>
+      </w:r>
+      <w:r>
+        <w:t xml:space="preserve"> </w:t>
+      </w:r>
+      <w:r>
+        <w:t xml:space="preserve">arXiv:2603.27539 [cs.MA].</w:t>
+      </w:r>
+      <w:r>
+        <w:t xml:space="preserve"> </w:t>
+      </w:r>
+    </w:p>
+    <w:p>
+      <w:pPr>
+        <w:pStyle w:val="BodyText"/>
+      </w:pPr>
+      <w:r>
+        <w:t xml:space="preserve">Papadakis, C., Filandrianos, G., Dimitriou, A., Lymperaiou, M., Thomas, K. and Stamou, G., 2025. StockSim: A Dual-Mode Order-Level Simulator for Evaluating Multi-Agent LLMs in Financial Markets.</w:t>
+      </w:r>
+      <w:r>
+        <w:t xml:space="preserve"> </w:t>
+      </w:r>
+      <w:r>
+        <w:t xml:space="preserve"> </w:t>
+      </w:r>
+      <w:r>
+        <w:t xml:space="preserve">arXiv:2507.09255 [cs.CE].</w:t>
+      </w:r>
+      <w:r>
+        <w:t xml:space="preserve"> </w:t>
+      </w:r>
+    </w:p>
+    <w:p>
+      <w:pPr>
+        <w:pStyle w:val="BodyText"/>
+      </w:pPr>
+      <w:r>
+        <w:t xml:space="preserve">Qian, L., Peng, X., Wang, Y., Zhang, V.J., He, H., Li, Z., Smith, H., Han, Y., He, Y., Li, H., Cao, Y., Yu, Y., Lopez-Lira, A., Lu, P., Nie, J.-Y., Xiong, G., Huang, J. and Ananiadou, S., 2026. When Agents Trade: Live Multi-Market Trading Arena for LLM Agents. In</w:t>
+      </w:r>
+      <w:r>
+        <w:t xml:space="preserve"> </w:t>
+      </w:r>
+      <w:r>
+        <w:t xml:space="preserve">.</w:t>
+      </w:r>
+      <w:r>
+        <w:t xml:space="preserve"> </w:t>
+      </w:r>
+    </w:p>
+    <w:p>
+      <w:pPr>
+        <w:pStyle w:val="BodyText"/>
+      </w:pPr>
+      <w:r>
         <w:t xml:space="preserve">Xiao, Y., Sun, E., Luo, D. and Wang, W., 2024. TradingAgents: Multi-Agents LLM Financial Trading Framework.</w:t>
       </w:r>
       <w:r>
         <w:t xml:space="preserve"> </w:t>
       </w:r>
       <w:r>
-        <w:rPr>
-          <w:i/>
-          <w:iCs/>
-        </w:rPr>
-        <w:t xml:space="preserve">arXiv preprint</w:t>
-      </w:r>
-      <w:r>
-        <w:t xml:space="preserve"> </w:t>
-      </w:r>
-      <w:r>
-        <w:t xml:space="preserve">arXiv:2412.20138 [q-fin.TR]. Available at: https://arxiv.org/abs/2412.20138 (Accessed: 29 May 2026).</w:t>
+        <w:t xml:space="preserve"> </w:t>
+      </w:r>
+      <w:r>
+        <w:t xml:space="preserve">arXiv:2412.20138 [q-fin.TR].</w:t>
+      </w:r>
+      <w:r>
+        <w:t xml:space="preserve"> </w:t>
       </w:r>
     </w:p>
     <w:p>
@@ -1400,17 +1922,13 @@
         <w:t xml:space="preserve"> </w:t>
       </w:r>
       <w:r>
-        <w:rPr>
-          <w:i/>
-          <w:iCs/>
-        </w:rPr>
-        <w:t xml:space="preserve">arXiv preprint</w:t>
-      </w:r>
-      <w:r>
-        <w:t xml:space="preserve"> </w:t>
-      </w:r>
-      <w:r>
-        <w:t xml:space="preserve">arXiv:2306.06031 [q-fin.ST]. Available at: https://arxiv.org/abs/2306.06031 (Accessed: 29 May 2026).</w:t>
+        <w:t xml:space="preserve"> </w:t>
+      </w:r>
+      <w:r>
+        <w:t xml:space="preserve">arXiv:2306.06031 [q-fin.ST].</w:t>
+      </w:r>
+      <w:r>
+        <w:t xml:space="preserve"> </w:t>
       </w:r>
     </w:p>
     <w:p>
@@ -1424,20 +1942,36 @@
         <w:t xml:space="preserve"> </w:t>
       </w:r>
       <w:r>
-        <w:rPr>
-          <w:i/>
-          <w:iCs/>
-        </w:rPr>
-        <w:t xml:space="preserve">arXiv preprint</w:t>
-      </w:r>
-      <w:r>
-        <w:t xml:space="preserve"> </w:t>
-      </w:r>
-      <w:r>
-        <w:t xml:space="preserve">arXiv:2311.13743 [q-fin.CP]. Available at: https://arxiv.org/abs/2311.13743 (Accessed: 29 May 2026).</w:t>
-      </w:r>
-    </w:p>
-    <w:bookmarkEnd w:id="21"/>
+        <w:t xml:space="preserve"> </w:t>
+      </w:r>
+      <w:r>
+        <w:t xml:space="preserve">arXiv:2311.13743 [q-fin.CP].</w:t>
+      </w:r>
+      <w:r>
+        <w:t xml:space="preserve"> </w:t>
+      </w:r>
+    </w:p>
+    <w:p>
+      <w:pPr>
+        <w:pStyle w:val="BodyText"/>
+      </w:pPr>
+      <w:r>
+        <w:t xml:space="preserve">Zhao, T., Lyu, J., Jones, S., Garber, H., Pasquali, S. and Mehta, D., 2025. AlphaAgents: Large Language Model based Multi-Agents for Equity Portfolio Constructions.</w:t>
+      </w:r>
+      <w:r>
+        <w:t xml:space="preserve"> </w:t>
+      </w:r>
+      <w:r>
+        <w:t xml:space="preserve"> </w:t>
+      </w:r>
+      <w:r>
+        <w:t xml:space="preserve">arXiv:2508.11152 [q-fin.ST].</w:t>
+      </w:r>
+      <w:r>
+        <w:t xml:space="preserve"> </w:t>
+      </w:r>
+    </w:p>
+    <w:bookmarkEnd w:id="23"/>
     <w:sectPr>
       <w:footnotePr>
         <w:numRestart w:val="eachSect"/>

</xml_diff>

<commit_message>
fix: added research critique points
</commit_message>
<xml_diff>
--- a/docs/paper/submission/Hindsight2020_AlgorithmicFinance_IOS_submission.docx
+++ b/docs/paper/submission/Hindsight2020_AlgorithmicFinance_IOS_submission.docx
@@ -196,7 +196,7 @@
         <w:t xml:space="preserve">one trajectory per window</w:t>
       </w:r>
       <w:r>
-        <w:t xml:space="preserve">, no seed averaging). In both bear windows, the agent loses less than buy-and-hold with lower drawdown; bull outcomes diverge (RELIANCE lags B&amp;H; TCS nearly tracks it). We interpret heterogeneous bull results as an architectural boundary of defensive multi-stage coordination. Code: https://github.com/RMartires/hindsight</w:t>
+        <w:t xml:space="preserve">, no seed averaging). In both bear windows, the agent loses less than buy-and-hold with lower drawdown; bull outcomes diverge (RELIANCE lags B&amp;H; TCS nearly tracks it). Heterogeneous bull outcomes are consistent with a structurally defensive posture; whether this reflects coordinated de-risking or reduced equity exposure is underdetermined at N=1. Code: https://github.com/RMartires/hindsight</w:t>
       </w:r>
     </w:p>
     <w:p>
@@ -1407,7 +1407,7 @@
           <w:b/>
           <w:bCs/>
         </w:rPr>
-        <w:t xml:space="preserve">Table 1.</w:t>
+        <w:t xml:space="preserve">Table 3.</w:t>
       </w:r>
       <w:r>
         <w:t xml:space="preserve"> </w:t>
@@ -1425,7 +1425,7 @@
           <w:b/>
           <w:bCs/>
         </w:rPr>
-        <w:t xml:space="preserve">Table 3.</w:t>
+        <w:t xml:space="preserve">Table 4.</w:t>
       </w:r>
       <w:r>
         <w:t xml:space="preserve"> </w:t>
@@ -1466,13 +1466,88 @@
         <w:t xml:space="preserve"> </w:t>
       </w:r>
       <w:r>
-        <w:t xml:space="preserve">Bear (2/2): smaller loss and lower MDD than B&amp;H; SELL-heavy signals. Bull: TCS nearly tracks B&amp;H; RELIANCE lags despite positive return (+5.6%)—fee drag ($</w:t>
-      </w:r>
-      <w:r>
-        <w:t xml:space="preserve">$0.6pp) does not explain the $</w:t>
-      </w:r>
-      <w:r>
-        <w:t xml:space="preserve">$9.5pp alpha gap; defensive final policy (74 SELL days) is the plausible binding constraint. Internal bull stances can remain buy-leaning while final signals stay defensive.</w:t>
+        <w:t xml:space="preserve">Bear (2/2): the agent generated smaller losses and lower MDD than B&amp;H; SELL-heavy signals in both windows. Bull: TCS nearly tracks B&amp;H; RELIANCE generated a positive return (+5.6%) but lagged by about 9.5pp; fee drag (about 0.6pp) is insufficient to explain the gap; 74 SELL days in the bull window is the plausible binding factor. Internal bull stances can remain buy-leaning while final signals stay defensive.</w:t>
+      </w:r>
+    </w:p>
+    <w:p>
+      <w:pPr>
+        <w:pStyle w:val="BodyText"/>
+      </w:pPr>
+      <w:r>
+        <w:rPr>
+          <w:b/>
+          <w:bCs/>
+        </w:rPr>
+        <w:t xml:space="preserve">Capture and exposure.</w:t>
+      </w:r>
+      <w:r>
+        <w:t xml:space="preserve"> </w:t>
+      </w:r>
+      <w:r>
+        <w:t xml:space="preserve">Approximate upside/downside capture ratios reveal a ticker-level distinction. RELIANCE exhibits 43% downside capture and 37% upside capture, a near-symmetric reduction consistent with effective equity exposure below 1.0 rather than selective de-risking. TCS exhibits 24% downside capture and 89% upside capture, a meaningfully asymmetric profile. At N=1 these ratios are descriptive, not diagnostic, but they counsel caution in attributing RELIANCE bear outperformance to regime-aware coordination; a structurally low-exposure posture produces the same pattern mechanically.</w:t>
+      </w:r>
+    </w:p>
+    <w:p>
+      <w:pPr>
+        <w:pStyle w:val="BodyText"/>
+      </w:pPr>
+      <w:r>
+        <w:rPr>
+          <w:b/>
+          <w:bCs/>
+        </w:rPr>
+        <w:t xml:space="preserve">Ticker-vs-regime ambiguity.</w:t>
+      </w:r>
+      <w:r>
+        <w:t xml:space="preserve"> </w:t>
+      </w:r>
+      <w:r>
+        <w:t xml:space="preserve">The secondary risk-adjusted metrics (Table 4) reorganise the story: the agent exceeds B&amp;H excess Sharpe in both TCS windows and trails in both RELIANCE windows, a ticker-level split. This reading is equally consistent with the four data points as the regime framing. Neither interpretation is statistically supportable at N=4; both are noted for transparency.</w:t>
+      </w:r>
+    </w:p>
+    <w:p>
+      <w:pPr>
+        <w:pStyle w:val="BodyText"/>
+      </w:pPr>
+      <w:r>
+        <w:rPr>
+          <w:b/>
+          <w:bCs/>
+        </w:rPr>
+        <w:t xml:space="preserve">RELIANCE bear Sharpe note.</w:t>
+      </w:r>
+      <w:r>
+        <w:t xml:space="preserve"> </w:t>
+      </w:r>
+      <w:r>
+        <w:t xml:space="preserve">In the RELIANCE bear window the agent records a smaller absolute loss (</w:t>
+      </w:r>
+      <w:r>
+        <w:t xml:space="preserve"> </w:t>
+      </w:r>
+      <w:r>
+        <w:t xml:space="preserve">vs</w:t>
+      </w:r>
+      <w:r>
+        <w:t xml:space="preserve"> </w:t>
+      </w:r>
+      <w:r>
+        <w:t xml:space="preserve">) yet a worse excess Sharpe (</w:t>
+      </w:r>
+      <w:r>
+        <w:t xml:space="preserve"> </w:t>
+      </w:r>
+      <w:r>
+        <w:t xml:space="preserve">vs</w:t>
+      </w:r>
+      <w:r>
+        <w:t xml:space="preserve"> </w:t>
+      </w:r>
+      <w:r>
+        <w:t xml:space="preserve"> </w:t>
+      </w:r>
+      <w:r>
+        <w:t xml:space="preserve">for B&amp;H). A near-cash, low-volatility posture with a small negative excess return produces a large negative annualised Sharpe on a short window; this is a mechanical artefact of the ratio on concentrated SELL sequences, not a contradiction in the data.</w:t>
       </w:r>
     </w:p>
     <w:bookmarkEnd w:id="17"/>
@@ -1532,23 +1607,7 @@
         <w:t xml:space="preserve">scoped four-window case study</w:t>
       </w:r>
       <w:r>
-        <w:t xml:space="preserve">. Bear windows show lower loss and drawdown than B&amp;H; bull outcomes are heterogeneous—an</w:t>
-      </w:r>
-      <w:r>
-        <w:t xml:space="preserve"> </w:t>
-      </w:r>
-      <w:r>
-        <w:rPr>
-          <w:b/>
-          <w:bCs/>
-        </w:rPr>
-        <w:t xml:space="preserve">architectural boundary</w:t>
-      </w:r>
-      <w:r>
-        <w:t xml:space="preserve"> </w:t>
-      </w:r>
-      <w:r>
-        <w:t xml:space="preserve">of defensive coordination, not a universal alpha claim.</w:t>
+        <w:t xml:space="preserve">. Bear windows show lower loss and drawdown than B&amp;H; bull outcomes are heterogeneous. Risk-adjusted metrics split by ticker rather than regime—both framings are equally consistent with N=4 data points, and no causal claim about coordination quality is made.</w:t>
       </w:r>
     </w:p>
     <w:p>
@@ -1625,7 +1684,7 @@
         </w:numPr>
       </w:pPr>
       <w:r>
-        <w:t xml:space="preserve">Point-in-time policy and optional anonymization.</w:t>
+        <w:t xml:space="preserve">Point-in-time policy and optional anonymization (ablation deferred to future work).</w:t>
       </w:r>
     </w:p>
     <w:p>

</xml_diff>